<commit_message>
docs: Draft v8 with 11 tracked changes across 8 negotiation rounds
</commit_message>
<xml_diff>
--- a/assets/docs/CTA_SB_Draft_v8_최종수정본.docx
+++ b/assets/docs/CTA_SB_Draft_v8_최종수정본.docx
@@ -22,7 +22,7 @@
     </w:p>
     <w:p>
       <w:pPr>
-        <w:spacing w:after="40" w:before="0"/>
+        <w:spacing w:after="280" w:before="0"/>
         <w:jc w:val="center"/>
       </w:pPr>
       <w:r>
@@ -33,14 +33,6 @@
           <w:szCs w:val="18"/>
         </w:rPr>
         <w:t xml:space="preserve">IRB No.: 51039  ·  Contract No.: SB-2024-LC3-001  ·  Rev. 8</w:t>
-      </w:r>
-    </w:p>
-    <w:p>
-      <w:pPr>
-        <w:spacing w:after="240" w:before="0"/>
-      </w:pPr>
-      <w:r>
-        <w:t xml:space="preserve"/>
       </w:r>
     </w:p>
     <w:tbl>
@@ -234,7 +226,7 @@
                 <w:sz w:val="18"/>
                 <w:szCs w:val="18"/>
               </w:rPr>
-              <w:t xml:space="preserve">Jae-Ho Lee, MD, PhD  ·  Department of Hemato-Oncology, Ajou University Hospital</w:t>
+              <w:t xml:space="preserve">Jae-Ho Lee, MD, PhD  ·  Dept. of Hemato-Oncology, Ajou University Hospital</w:t>
             </w:r>
           </w:p>
         </w:tc>
@@ -354,7 +346,7 @@
                 <w:sz w:val="18"/>
                 <w:szCs w:val="18"/>
               </w:rPr>
-              <w:t xml:space="preserve">A Randomized, Double-Blind, Phase 3 Study of SB-LC-304 (Antibody-Drug Conjugate) Versus Docetaxel in Patients with Previously Treated Advanced Non-Small Cell Lung Cancer (NSCLC) — "LUMINOS-3"</w:t>
+              <w:t xml:space="preserve">A Randomized, Double-Blind, Phase 3 Study of SB-LC-304 (ADC) vs. Docetaxel in Previously Treated Advanced NSCLC — "LUMINOS-3"</w:t>
             </w:r>
           </w:p>
         </w:tc>
@@ -447,7 +439,7 @@
                 <w:sz w:val="18"/>
                 <w:szCs w:val="18"/>
               </w:rPr>
-              <w:t xml:space="preserve">IND No.</w:t>
+              <w:t xml:space="preserve">Effective Date</w:t>
             </w:r>
           </w:p>
         </w:tc>
@@ -474,7 +466,7 @@
                 <w:sz w:val="18"/>
                 <w:szCs w:val="18"/>
               </w:rPr>
-              <w:t xml:space="preserve">IND-2024-51039-KR</w:t>
+              <w:t xml:space="preserve">Upon execution by all parties following IRB approval</w:t>
             </w:r>
           </w:p>
         </w:tc>
@@ -507,7 +499,7 @@
                 <w:sz w:val="18"/>
                 <w:szCs w:val="18"/>
               </w:rPr>
-              <w:t xml:space="preserve">Effective Date</w:t>
+              <w:t xml:space="preserve">Document Version</w:t>
             </w:r>
           </w:p>
         </w:tc>
@@ -534,67 +526,7 @@
                 <w:sz w:val="18"/>
                 <w:szCs w:val="18"/>
               </w:rPr>
-              <w:t xml:space="preserve">Upon execution by all parties following IRB approval</w:t>
-            </w:r>
-          </w:p>
-        </w:tc>
-      </w:tr>
-      <w:tr>
-        <w:tc>
-          <w:tcPr>
-            <w:tcW w:type="dxa" w:w="2520"/>
-            <w:tcBorders>
-              <w:top w:val="single" w:color="CCCCCC" w:sz="4"/>
-              <w:left w:val="single" w:color="CCCCCC" w:sz="4"/>
-              <w:bottom w:val="single" w:color="CCCCCC" w:sz="4"/>
-              <w:right w:val="single" w:color="CCCCCC" w:sz="4"/>
-            </w:tcBorders>
-            <w:shd w:fill="F0F4F8" w:val="clear"/>
-            <w:tcMar>
-              <w:top w:type="dxa" w:w="60"/>
-              <w:left w:type="dxa" w:w="100"/>
-              <w:bottom w:type="dxa" w:w="60"/>
-              <w:right w:type="dxa" w:w="100"/>
-            </w:tcMar>
-          </w:tcPr>
-          <w:p>
-            <w:r>
-              <w:rPr>
-                <w:rFonts w:ascii="Times New Roman" w:cs="Times New Roman" w:eastAsia="Times New Roman" w:hAnsi="Times New Roman"/>
-                <w:b/>
-                <w:bCs/>
-                <w:color w:val="1A2D4A"/>
-                <w:sz w:val="18"/>
-                <w:szCs w:val="18"/>
-              </w:rPr>
-              <w:t xml:space="preserve">Document Version</w:t>
-            </w:r>
-          </w:p>
-        </w:tc>
-        <w:tc>
-          <w:tcPr>
-            <w:tcW w:type="dxa" w:w="6480"/>
-            <w:tcBorders>
-              <w:top w:val="single" w:color="CCCCCC" w:sz="4"/>
-              <w:left w:val="single" w:color="CCCCCC" w:sz="4"/>
-              <w:bottom w:val="single" w:color="CCCCCC" w:sz="4"/>
-              <w:right w:val="single" w:color="CCCCCC" w:sz="4"/>
-            </w:tcBorders>
-            <w:tcMar>
-              <w:top w:type="dxa" w:w="60"/>
-              <w:left w:type="dxa" w:w="100"/>
-              <w:bottom w:type="dxa" w:w="60"/>
-              <w:right w:type="dxa" w:w="100"/>
-            </w:tcMar>
-          </w:tcPr>
-          <w:p>
-            <w:r>
-              <w:rPr>
-                <w:rFonts w:ascii="Times New Roman" w:cs="Times New Roman" w:eastAsia="Times New Roman" w:hAnsi="Times New Roman"/>
-                <w:sz w:val="18"/>
-                <w:szCs w:val="18"/>
-              </w:rPr>
-              <w:t xml:space="preserve">Draft v8  (Track Changes from v7)  —  2024.07.12</w:t>
+              <w:t xml:space="preserve">Draft v8  (Tracked Changes from v1–v7)  —  2024.07.12</w:t>
             </w:r>
           </w:p>
         </w:tc>
@@ -613,7 +545,7 @@
         <w:pBdr>
           <w:bottom w:val="single" w:color="1A2D4A" w:sz="6"/>
         </w:pBdr>
-        <w:spacing w:after="120" w:before="280"/>
+        <w:spacing w:after="120" w:before="320"/>
       </w:pPr>
       <w:r>
         <w:rPr>
@@ -629,7 +561,7 @@
     </w:p>
     <w:p>
       <w:pPr>
-        <w:spacing w:after="80" w:before="160"/>
+        <w:spacing w:after="80" w:before="180"/>
       </w:pPr>
       <w:r>
         <w:rPr>
@@ -653,23 +585,23 @@
           <w:sz w:val="20"/>
           <w:szCs w:val="20"/>
         </w:rPr>
-        <w:t xml:space="preserve">By executing this Order, the parties agree that this Order and the parties' performance hereunder shall be governed by the terms and conditions of the Master Clinical Trial Agreement (Contract No. SB-2024-LC3-001), which are incorporated by this reference as if fully set forth herein. In the event of any conflict between this Order and the Master Agreement, the terms of this Order shall prevail.</w:t>
-      </w:r>
-    </w:p>
-    <w:p>
-      <w:pPr>
-        <w:spacing w:after="80" w:before="160"/>
-      </w:pPr>
-      <w:r>
-        <w:rPr>
-          <w:rFonts w:ascii="Times New Roman" w:cs="Times New Roman" w:eastAsia="Times New Roman" w:hAnsi="Times New Roman"/>
-          <w:b/>
-          <w:bCs/>
-          <w:color w:val="1A2D4A"/>
-          <w:sz w:val="20"/>
-          <w:szCs w:val="20"/>
-        </w:rPr>
-        <w:t xml:space="preserve">§ 1.2  Effective Date</w:t>
+        <w:t xml:space="preserve">By executing this Order, the parties agree that this Order and the parties' performance hereunder shall be governed by the terms and conditions of the Master Clinical Trial Agreement (Contract No. SB-2024-LC3-001). In the event of any conflict between this Order and the Master Agreement, the terms of this Order shall prevail.</w:t>
+      </w:r>
+    </w:p>
+    <w:p>
+      <w:pPr>
+        <w:spacing w:after="80" w:before="180"/>
+      </w:pPr>
+      <w:r>
+        <w:rPr>
+          <w:rFonts w:ascii="Times New Roman" w:cs="Times New Roman" w:eastAsia="Times New Roman" w:hAnsi="Times New Roman"/>
+          <w:b/>
+          <w:bCs/>
+          <w:color w:val="1A2D4A"/>
+          <w:sz w:val="20"/>
+          <w:szCs w:val="20"/>
+        </w:rPr>
+        <w:t xml:space="preserve">§ 1.2  Effective Date &amp; Study Period</w:t>
       </w:r>
     </w:p>
     <w:p>
@@ -682,23 +614,51 @@
           <w:sz w:val="20"/>
           <w:szCs w:val="20"/>
         </w:rPr>
-        <w:t xml:space="preserve">This Order shall become effective upon the date of the last signature affixed hereto ("Effective Date"), provided that Institutional Review Board (IRB) approval has been obtained and all regulatory requirements under the Pharmaceutical Affairs Law of the Republic of Korea have been satisfied. The anticipated study period runs from the Effective Date through 31 December 2027, subject to extension by mutual written agreement.</w:t>
-      </w:r>
-    </w:p>
-    <w:p>
-      <w:pPr>
-        <w:spacing w:after="80" w:before="160"/>
-      </w:pPr>
-      <w:r>
-        <w:rPr>
-          <w:rFonts w:ascii="Times New Roman" w:cs="Times New Roman" w:eastAsia="Times New Roman" w:hAnsi="Times New Roman"/>
-          <w:b/>
-          <w:bCs/>
-          <w:color w:val="1A2D4A"/>
-          <w:sz w:val="20"/>
-          <w:szCs w:val="20"/>
-        </w:rPr>
-        <w:t xml:space="preserve">§ 1.3  Applicable Law &amp; Regulatory Compliance</w:t>
+        <w:t xml:space="preserve">This Order shall become effective upon the date of the last signature affixed hereto. The anticipated study period runs from the Effective Date through </w:t>
+      </w:r>
+      <w:del w:id="201" w:author="정담당 (아주대병원)" w:date="2024-03-26T09:00:00Z">
+        <w:r>
+          <w:rPr>
+            <w:rFonts w:ascii="Times New Roman" w:cs="Times New Roman" w:hAnsi="Times New Roman"/>
+            <w:sz w:val="20"/>
+            <w:szCs w:val="20"/>
+          </w:rPr>
+          <w:delText xml:space="preserve">31 December 2027</w:delText>
+        </w:r>
+      </w:del>
+      <w:ins w:id="211" w:author="정담당 (아주대병원)" w:date="2024-03-26T09:00:00Z">
+        <w:r>
+          <w:rPr>
+            <w:rFonts w:ascii="Times New Roman" w:cs="Times New Roman" w:hAnsi="Times New Roman"/>
+            <w:sz w:val="20"/>
+            <w:szCs w:val="20"/>
+          </w:rPr>
+          <w:t xml:space="preserve">30 June 2028</w:t>
+        </w:r>
+      </w:ins>
+      <w:r>
+        <w:rPr>
+          <w:rFonts w:ascii="Times New Roman" w:cs="Times New Roman" w:hAnsi="Times New Roman"/>
+          <w:sz w:val="20"/>
+          <w:szCs w:val="20"/>
+        </w:rPr>
+        <w:t xml:space="preserve">, subject to extension by mutual written agreement.</w:t>
+      </w:r>
+    </w:p>
+    <w:p>
+      <w:pPr>
+        <w:spacing w:after="80" w:before="180"/>
+      </w:pPr>
+      <w:r>
+        <w:rPr>
+          <w:rFonts w:ascii="Times New Roman" w:cs="Times New Roman" w:eastAsia="Times New Roman" w:hAnsi="Times New Roman"/>
+          <w:b/>
+          <w:bCs/>
+          <w:color w:val="1A2D4A"/>
+          <w:sz w:val="20"/>
+          <w:szCs w:val="20"/>
+        </w:rPr>
+        <w:t xml:space="preserve">§ 1.3  Applicable Law</w:t>
       </w:r>
     </w:p>
     <w:p>
@@ -711,7 +671,7 @@
           <w:sz w:val="20"/>
           <w:szCs w:val="20"/>
         </w:rPr>
-        <w:t xml:space="preserve">The Study shall be conducted in accordance with: (a) the Declaration of Helsinki (2013 revision); (b) the Korean Good Clinical Practice Guideline (KGCP), as amended; (c) the Pharmaceutical Affairs Law and its subordinate regulations; (d) all applicable Ministry of Food and Drug Safety (MFDS) guidelines; and (e) the Institution's Standard Operating Procedures (SOPs), whichever affords the greater protection to Study Subjects.</w:t>
+        <w:t xml:space="preserve">The Study shall be conducted in accordance with: (a) the Declaration of Helsinki (2013 revision); (b) the Korean GCP Guideline; (c) the Pharmaceutical Affairs Law; (d) all applicable MFDS guidelines; and (e) the Institution's SOPs, whichever affords the greater protection to Study Subjects.</w:t>
       </w:r>
     </w:p>
     <w:p>
@@ -719,7 +679,7 @@
         <w:pBdr>
           <w:bottom w:val="single" w:color="1A2D4A" w:sz="6"/>
         </w:pBdr>
-        <w:spacing w:after="120" w:before="280"/>
+        <w:spacing w:after="120" w:before="320"/>
       </w:pPr>
       <w:r>
         <w:rPr>
@@ -735,7 +695,7 @@
     </w:p>
     <w:p>
       <w:pPr>
-        <w:spacing w:after="80" w:before="160"/>
+        <w:spacing w:after="80" w:before="180"/>
       </w:pPr>
       <w:r>
         <w:rPr>
@@ -759,12 +719,12 @@
           <w:sz w:val="20"/>
           <w:szCs w:val="20"/>
         </w:rPr>
-        <w:t xml:space="preserve">The Study shall be conducted in strict accordance with Protocol No. SB-LC-304-P3-KR-001 entitled "LUMINOS-3," as may be amended from time to time by Sponsor upon prior written notice to Institution. The Principal Investigator shall ensure that all sub-investigators and study site staff comply with protocol requirements at all times. Sponsor meal and beverage expenses at Investigator Meetings shall not exceed KRW 50,000 per person per occasion in accordance with the Korean Fair Competition Code.</w:t>
-      </w:r>
-    </w:p>
-    <w:p>
-      <w:pPr>
-        <w:spacing w:after="80" w:before="160"/>
+        <w:t xml:space="preserve">The Study shall be conducted in strict accordance with Protocol No. SB-LC-304-P3-KR-001 entitled "LUMINOS-3." The Principal Investigator shall ensure all study site staff comply with protocol requirements at all times. Sponsor meal and beverage expenses at Investigator Meetings shall not exceed KRW 50,000 per person per occasion.</w:t>
+      </w:r>
+    </w:p>
+    <w:p>
+      <w:pPr>
+        <w:spacing w:after="80" w:before="180"/>
       </w:pPr>
       <w:r>
         <w:rPr>
@@ -788,12 +748,12 @@
           <w:sz w:val="20"/>
           <w:szCs w:val="20"/>
         </w:rPr>
-        <w:t xml:space="preserve">Subject to applicable law, Sponsor may collect and process personal data relating to Investigators, sub-investigators, and other study site personnel for the purpose of conducting the Study, maintaining regulatory submissions, and conducting audits. Sponsor shall implement appropriate technical and organizational measures to protect such data and shall notify affected personnel as required by the Personal Information Protection Act (PIPA) and applicable EU GDPR requirements where relevant.</w:t>
-      </w:r>
-    </w:p>
-    <w:p>
-      <w:pPr>
-        <w:spacing w:after="80" w:before="160"/>
+        <w:t xml:space="preserve">Subject to applicable law, Sponsor may collect and process personal data relating to Investigators and other study site personnel for the purpose of conducting the Study. Sponsor shall implement appropriate measures to protect such data as required by the Personal Information Protection Act (PIPA).</w:t>
+      </w:r>
+    </w:p>
+    <w:p>
+      <w:pPr>
+        <w:spacing w:after="80" w:before="180"/>
       </w:pPr>
       <w:r>
         <w:rPr>
@@ -817,12 +777,40 @@
           <w:sz w:val="20"/>
           <w:szCs w:val="20"/>
         </w:rPr>
-        <w:t xml:space="preserve">Site agrees to enter all Study data into the Sponsor-designated EDC system (Medidata Rave) within 5 business days of the Subject visit or procedure generating such data, and to resolve all data queries issued by Sponsor or CRO within 5 business days of query issuance. Principal Investigator or designated sub-investigator shall apply electronic signature to all source documents within 90 calendar days of the Subject visit. Repeated failure to meet EDC timelines may result in additional monitoring visits at Institution's expense.</w:t>
-      </w:r>
-    </w:p>
-    <w:p>
-      <w:pPr>
-        <w:spacing w:after="80" w:before="160"/>
+        <w:t xml:space="preserve">Site agrees to enter all Study data into the Medidata Rave EDC system within </w:t>
+      </w:r>
+      <w:del w:id="202" w:author="정담당 (아주대병원)" w:date="2024-03-11T09:00:00Z">
+        <w:r>
+          <w:rPr>
+            <w:rFonts w:ascii="Times New Roman" w:cs="Times New Roman" w:hAnsi="Times New Roman"/>
+            <w:sz w:val="20"/>
+            <w:szCs w:val="20"/>
+          </w:rPr>
+          <w:delText xml:space="preserve">5</w:delText>
+        </w:r>
+      </w:del>
+      <w:ins w:id="212" w:author="정담당 (아주대병원)" w:date="2024-03-11T09:00:00Z">
+        <w:r>
+          <w:rPr>
+            <w:rFonts w:ascii="Times New Roman" w:cs="Times New Roman" w:hAnsi="Times New Roman"/>
+            <w:sz w:val="20"/>
+            <w:szCs w:val="20"/>
+          </w:rPr>
+          <w:t xml:space="preserve">7</w:t>
+        </w:r>
+      </w:ins>
+      <w:r>
+        <w:rPr>
+          <w:rFonts w:ascii="Times New Roman" w:cs="Times New Roman" w:hAnsi="Times New Roman"/>
+          <w:sz w:val="20"/>
+          <w:szCs w:val="20"/>
+        </w:rPr>
+        <w:t xml:space="preserve"> business days of the Subject visit, and to resolve all data queries within 5 business days of query issuance. Principal Investigator shall apply electronic signature within 90 calendar days of the Subject visit.</w:t>
+      </w:r>
+    </w:p>
+    <w:p>
+      <w:pPr>
+        <w:spacing w:after="80" w:before="180"/>
       </w:pPr>
       <w:r>
         <w:rPr>
@@ -846,7 +834,35 @@
           <w:sz w:val="20"/>
           <w:szCs w:val="20"/>
         </w:rPr>
-        <w:t xml:space="preserve">Institution shall report all Serious Adverse Events (SAEs) to Sponsor within 24 hours of the Principal Investigator's awareness, regardless of causality assessment. Expedited reports of Suspected Unexpected Serious Adverse Reactions (SUSARs) shall be submitted to MFDS within the timeframes prescribed by applicable regulations. Institution shall maintain complete SAE documentation and cooperate fully with Sponsor's pharmacovigilance team.</w:t>
+        <w:t xml:space="preserve">Institution shall report all Serious Adverse Events (SAEs) to Sponsor within </w:t>
+      </w:r>
+      <w:del w:id="203" w:author="정담당 (아주대병원)" w:date="2024-03-26T09:00:00Z">
+        <w:r>
+          <w:rPr>
+            <w:rFonts w:ascii="Times New Roman" w:cs="Times New Roman" w:hAnsi="Times New Roman"/>
+            <w:sz w:val="20"/>
+            <w:szCs w:val="20"/>
+          </w:rPr>
+          <w:delText xml:space="preserve">24</w:delText>
+        </w:r>
+      </w:del>
+      <w:ins w:id="213" w:author="정담당 (아주대병원)" w:date="2024-03-26T09:00:00Z">
+        <w:r>
+          <w:rPr>
+            <w:rFonts w:ascii="Times New Roman" w:cs="Times New Roman" w:hAnsi="Times New Roman"/>
+            <w:sz w:val="20"/>
+            <w:szCs w:val="20"/>
+          </w:rPr>
+          <w:t xml:space="preserve">48</w:t>
+        </w:r>
+      </w:ins>
+      <w:r>
+        <w:rPr>
+          <w:rFonts w:ascii="Times New Roman" w:cs="Times New Roman" w:hAnsi="Times New Roman"/>
+          <w:sz w:val="20"/>
+          <w:szCs w:val="20"/>
+        </w:rPr>
+        <w:t xml:space="preserve"> hours of the Principal Investigator's awareness, regardless of causality assessment. SUSARs shall be submitted to MFDS within the timeframes prescribed by applicable regulations.</w:t>
       </w:r>
     </w:p>
     <w:p>
@@ -854,7 +870,7 @@
         <w:pBdr>
           <w:bottom w:val="single" w:color="1A2D4A" w:sz="6"/>
         </w:pBdr>
-        <w:spacing w:after="120" w:before="280"/>
+        <w:spacing w:after="120" w:before="320"/>
       </w:pPr>
       <w:r>
         <w:rPr>
@@ -870,7 +886,7 @@
     </w:p>
     <w:p>
       <w:pPr>
-        <w:spacing w:after="80" w:before="160"/>
+        <w:spacing w:after="80" w:before="180"/>
       </w:pPr>
       <w:r>
         <w:rPr>
@@ -894,12 +910,12 @@
           <w:sz w:val="20"/>
           <w:szCs w:val="20"/>
         </w:rPr>
-        <w:t xml:space="preserve">Sponsor shall supply SB-LC-304 Investigational Medicinal Product (IMP) and matching placebo at no cost to Institution or Study Subjects. Sponsor retains title to all IMP at all times. Institution shall store, handle, dispense, and account for all IMP strictly in accordance with the Investigator's Brochure, protocol, and applicable pharmacy guidelines. Any unused or returned IMP shall be reconciled and, unless otherwise directed, returned to Sponsor or destroyed per Sponsor's instructions.</w:t>
-      </w:r>
-    </w:p>
-    <w:p>
-      <w:pPr>
-        <w:spacing w:after="80" w:before="160"/>
+        <w:t xml:space="preserve">Sponsor shall supply SB-LC-304 IMP and matching placebo at no cost to Institution or Study Subjects. Sponsor retains title to all IMP at all times. Institution shall handle and account for all IMP in accordance with the Investigator's Brochure and applicable pharmacy guidelines.</w:t>
+      </w:r>
+    </w:p>
+    <w:p>
+      <w:pPr>
+        <w:spacing w:after="80" w:before="180"/>
       </w:pPr>
       <w:r>
         <w:rPr>
@@ -923,12 +939,58 @@
           <w:sz w:val="20"/>
           <w:szCs w:val="20"/>
         </w:rPr>
-        <w:t xml:space="preserve">Sponsor shall reimburse Institution for reasonable costs of non-IMP study materials (laboratory kits, patient diaries, imaging media) at the rates set forth in Exhibit B (Budget). Any materials procured by Institution outside the agreed list require prior written authorization from Sponsor's Clinical Operations team. Requests for additional cost reimbursement must be submitted within 30 days of cost incurrence.</w:t>
-      </w:r>
-    </w:p>
-    <w:p>
-      <w:pPr>
-        <w:spacing w:after="80" w:before="160"/>
+        <w:t xml:space="preserve">Sponsor shall reimburse Institution for reasonable costs of non-IMP study materials at the rates set forth in Exhibit B. </w:t>
+      </w:r>
+      <w:ins w:id="220" w:author="정담당 (아주대병원)" w:date="2024-03-11T09:00:00Z">
+        <w:r>
+          <w:rPr>
+            <w:rFonts w:ascii="Times New Roman" w:cs="Times New Roman" w:hAnsi="Times New Roman"/>
+            <w:sz w:val="20"/>
+            <w:szCs w:val="20"/>
+          </w:rPr>
+          <w:t xml:space="preserve">All reimbursable costs are subject to a 15% institutional overhead surcharge as agreed per IRB administrative fee schedule. </w:t>
+        </w:r>
+      </w:ins>
+      <w:r>
+        <w:rPr>
+          <w:rFonts w:ascii="Times New Roman" w:cs="Times New Roman" w:hAnsi="Times New Roman"/>
+          <w:sz w:val="20"/>
+          <w:szCs w:val="20"/>
+        </w:rPr>
+        <w:t xml:space="preserve">Requests for reimbursement must be submitted within </w:t>
+      </w:r>
+      <w:del w:id="204" w:author="박연구 (삼성바이오로직스)" w:date="2024-04-14T09:00:00Z">
+        <w:r>
+          <w:rPr>
+            <w:rFonts w:ascii="Times New Roman" w:cs="Times New Roman" w:hAnsi="Times New Roman"/>
+            <w:sz w:val="20"/>
+            <w:szCs w:val="20"/>
+          </w:rPr>
+          <w:delText xml:space="preserve">30</w:delText>
+        </w:r>
+      </w:del>
+      <w:ins w:id="214" w:author="박연구 (삼성바이오로직스)" w:date="2024-04-14T09:00:00Z">
+        <w:r>
+          <w:rPr>
+            <w:rFonts w:ascii="Times New Roman" w:cs="Times New Roman" w:hAnsi="Times New Roman"/>
+            <w:sz w:val="20"/>
+            <w:szCs w:val="20"/>
+          </w:rPr>
+          <w:t xml:space="preserve">14</w:t>
+        </w:r>
+      </w:ins>
+      <w:r>
+        <w:rPr>
+          <w:rFonts w:ascii="Times New Roman" w:cs="Times New Roman" w:hAnsi="Times New Roman"/>
+          <w:sz w:val="20"/>
+          <w:szCs w:val="20"/>
+        </w:rPr>
+        <w:t xml:space="preserve"> days of cost incurrence and are subject to Sponsor's prior written approval.</w:t>
+      </w:r>
+    </w:p>
+    <w:p>
+      <w:pPr>
+        <w:spacing w:after="80" w:before="180"/>
       </w:pPr>
       <w:r>
         <w:rPr>
@@ -952,7 +1014,7 @@
           <w:sz w:val="20"/>
           <w:szCs w:val="20"/>
         </w:rPr>
-        <w:t xml:space="preserve">Docetaxel (comparator arm) shall be procured and supplied by Institution through standard hospital pharmacy channels at Sponsor's expense per the unit costs specified in Exhibit B. Institution shall maintain accurate dispensing records and provide monthly reconciliation reports to Sponsor within 10 business days of each calendar month end.</w:t>
+        <w:t xml:space="preserve">Docetaxel (comparator arm) shall be procured and supplied by Institution through standard hospital pharmacy channels at Sponsor's expense per the unit costs in Exhibit B. Institution shall maintain accurate dispensing records and provide monthly reconciliation reports within 10 business days of each month end.</w:t>
       </w:r>
     </w:p>
     <w:p>
@@ -960,7 +1022,7 @@
         <w:pBdr>
           <w:bottom w:val="single" w:color="1A2D4A" w:sz="6"/>
         </w:pBdr>
-        <w:spacing w:after="120" w:before="280"/>
+        <w:spacing w:after="120" w:before="320"/>
       </w:pPr>
       <w:r>
         <w:rPr>
@@ -976,7 +1038,7 @@
     </w:p>
     <w:p>
       <w:pPr>
-        <w:spacing w:after="80" w:before="160"/>
+        <w:spacing w:after="80" w:before="180"/>
       </w:pPr>
       <w:r>
         <w:rPr>
@@ -1002,49 +1064,49 @@
         </w:rPr>
         <w:t xml:space="preserve">Site agrees to enroll the first Study Subject within </w:t>
       </w:r>
-      <w:del w:id="101" w:author="박연구 (삼성바이오로직스)" w:date="2024-07-10T09:00:00Z">
+      <w:del w:id="206" w:author="박연구 (삼성바이오로직스)" w:date="2024-07-10T09:00:00Z">
         <w:r>
           <w:rPr>
-            <w:rFonts w:ascii="Times New Roman" w:cs="Times New Roman" w:eastAsia="Times New Roman" w:hAnsi="Times New Roman"/>
+            <w:rFonts w:ascii="Times New Roman" w:cs="Times New Roman" w:hAnsi="Times New Roman"/>
             <w:sz w:val="20"/>
             <w:szCs w:val="20"/>
           </w:rPr>
-          <w:delText>30</w:delText>
+          <w:delText xml:space="preserve">30</w:delText>
         </w:r>
       </w:del>
-      <w:ins w:id="102" w:author="박연구 (삼성바이오로직스)" w:date="2024-07-10T09:00:00Z">
+      <w:ins w:id="216" w:author="박연구 (삼성바이오로직스)" w:date="2024-07-10T09:00:00Z">
         <w:r>
           <w:rPr>
-            <w:rFonts w:ascii="Times New Roman" w:cs="Times New Roman" w:eastAsia="Times New Roman" w:hAnsi="Times New Roman"/>
+            <w:rFonts w:ascii="Times New Roman" w:cs="Times New Roman" w:hAnsi="Times New Roman"/>
             <w:sz w:val="20"/>
             <w:szCs w:val="20"/>
           </w:rPr>
-          <w:t>45</w:t>
+          <w:t xml:space="preserve">45</w:t>
         </w:r>
       </w:ins>
       <w:r>
         <w:rPr>
-          <w:rFonts w:ascii="Times New Roman" w:cs="Times New Roman" w:eastAsia="Times New Roman" w:hAnsi="Times New Roman"/>
-          <w:sz w:val="20"/>
-          <w:szCs w:val="20"/>
-        </w:rPr>
-        <w:t xml:space="preserve"> calendar days of the Effective Date. Failure to enroll the first Subject within this period shall entitle Sponsor to terminate this Order upon 14 days' written notice, unless Site provides written justification satisfactory to Sponsor for the delay. Time to first enrollment shall be measured from the date of final IRB approval and execution of this Order by all parties.</w:t>
-      </w:r>
-    </w:p>
-    <w:p>
-      <w:pPr>
-        <w:spacing w:after="80" w:before="160"/>
-      </w:pPr>
-      <w:r>
-        <w:rPr>
-          <w:rFonts w:ascii="Times New Roman" w:cs="Times New Roman" w:eastAsia="Times New Roman" w:hAnsi="Times New Roman"/>
-          <w:b/>
-          <w:bCs/>
-          <w:color w:val="1A2D4A"/>
-          <w:sz w:val="20"/>
-          <w:szCs w:val="20"/>
-        </w:rPr>
-        <w:t xml:space="preserve">§ 4.2  Enrollment Target &amp; Timeline</w:t>
+          <w:rFonts w:ascii="Times New Roman" w:cs="Times New Roman" w:hAnsi="Times New Roman"/>
+          <w:sz w:val="20"/>
+          <w:szCs w:val="20"/>
+        </w:rPr>
+        <w:t xml:space="preserve"> calendar days of the Effective Date. Failure to enroll within this period shall entitle Sponsor to terminate this Order upon 14 days' written notice, unless Site provides written justification satisfactory to Sponsor.</w:t>
+      </w:r>
+    </w:p>
+    <w:p>
+      <w:pPr>
+        <w:spacing w:after="80" w:before="180"/>
+      </w:pPr>
+      <w:r>
+        <w:rPr>
+          <w:rFonts w:ascii="Times New Roman" w:cs="Times New Roman" w:eastAsia="Times New Roman" w:hAnsi="Times New Roman"/>
+          <w:b/>
+          <w:bCs/>
+          <w:color w:val="1A2D4A"/>
+          <w:sz w:val="20"/>
+          <w:szCs w:val="20"/>
+        </w:rPr>
+        <w:t xml:space="preserve">§ 4.2  Enrollment Target</w:t>
       </w:r>
     </w:p>
     <w:p>
@@ -1057,12 +1119,40 @@
           <w:sz w:val="20"/>
           <w:szCs w:val="20"/>
         </w:rPr>
-        <w:t xml:space="preserve">Site agrees to enroll a minimum of 12 evaluable Study Subjects during the Enrollment Period, which shall commence on the Effective Date and continue through 31 March 2026 ("Enrollment Period"). Sponsor reserves the right to reallocate enrollment targets among participating sites if Site falls more than 30 days behind the agreed enrollment trajectory set forth in Exhibit C (Enrollment Milestones).</w:t>
-      </w:r>
-    </w:p>
-    <w:p>
-      <w:pPr>
-        <w:spacing w:after="80" w:before="160"/>
+        <w:t xml:space="preserve">Site agrees to enroll a minimum of </w:t>
+      </w:r>
+      <w:del w:id="207" w:author="정담당 (아주대병원)" w:date="2024-03-26T09:00:00Z">
+        <w:r>
+          <w:rPr>
+            <w:rFonts w:ascii="Times New Roman" w:cs="Times New Roman" w:hAnsi="Times New Roman"/>
+            <w:sz w:val="20"/>
+            <w:szCs w:val="20"/>
+          </w:rPr>
+          <w:delText xml:space="preserve">12</w:delText>
+        </w:r>
+      </w:del>
+      <w:ins w:id="217" w:author="정담당 (아주대병원)" w:date="2024-03-26T09:00:00Z">
+        <w:r>
+          <w:rPr>
+            <w:rFonts w:ascii="Times New Roman" w:cs="Times New Roman" w:hAnsi="Times New Roman"/>
+            <w:sz w:val="20"/>
+            <w:szCs w:val="20"/>
+          </w:rPr>
+          <w:t xml:space="preserve">8</w:t>
+        </w:r>
+      </w:ins>
+      <w:r>
+        <w:rPr>
+          <w:rFonts w:ascii="Times New Roman" w:cs="Times New Roman" w:hAnsi="Times New Roman"/>
+          <w:sz w:val="20"/>
+          <w:szCs w:val="20"/>
+        </w:rPr>
+        <w:t xml:space="preserve"> evaluable Study Subjects during the Enrollment Period through 31 March 2026. Sponsor reserves the right to reallocate enrollment targets among participating sites if Site falls more than 30 days behind the agreed trajectory.</w:t>
+      </w:r>
+    </w:p>
+    <w:p>
+      <w:pPr>
+        <w:spacing w:after="80" w:before="180"/>
       </w:pPr>
       <w:r>
         <w:rPr>
@@ -1086,7 +1176,7 @@
           <w:sz w:val="20"/>
           <w:szCs w:val="20"/>
         </w:rPr>
-        <w:t xml:space="preserve">Screen failures shall be documented in the EDC system within 5 business days of the screening visit. Sponsor will reimburse screen failure costs at 40% of the per-subject fee specified in Exhibit B for Subjects who complete screening procedures but do not meet eligibility criteria. Screen failure rate exceeding 40% shall trigger a protocol deviation review meeting between Sponsor, CRO, and Principal Investigator.</w:t>
+        <w:t xml:space="preserve">Screen failures shall be documented in the EDC system within 5 business days of the screening visit. Sponsor will reimburse screen failure costs at 40% of the per-subject fee for Subjects who complete screening but do not meet eligibility criteria.</w:t>
       </w:r>
     </w:p>
     <w:p>
@@ -1094,7 +1184,7 @@
         <w:pBdr>
           <w:bottom w:val="single" w:color="1A2D4A" w:sz="6"/>
         </w:pBdr>
-        <w:spacing w:after="120" w:before="280"/>
+        <w:spacing w:after="120" w:before="320"/>
       </w:pPr>
       <w:r>
         <w:rPr>
@@ -1110,7 +1200,7 @@
     </w:p>
     <w:p>
       <w:pPr>
-        <w:spacing w:after="80" w:before="160"/>
+        <w:spacing w:after="80" w:before="180"/>
       </w:pPr>
       <w:r>
         <w:rPr>
@@ -1134,12 +1224,40 @@
           <w:sz w:val="20"/>
           <w:szCs w:val="20"/>
         </w:rPr>
-        <w:t xml:space="preserve">Sponsor shall pay Institution per-subject fees in accordance with the Budget (Exhibit B), which shall constitute full compensation for all Study-related services, overhead, and institutional costs. Per-subject fees shall be invoiced upon completion of each Subject's protocol-specified visit milestones and shall be paid within 45 calendar days of Sponsor's receipt of a valid invoice. All invoices shall be submitted to Sponsor's Accounts Payable in the format specified in Exhibit D.</w:t>
-      </w:r>
-    </w:p>
-    <w:p>
-      <w:pPr>
-        <w:spacing w:after="80" w:before="160"/>
+        <w:t xml:space="preserve">Sponsor shall pay Institution per-subject fees in accordance with Exhibit B, which shall constitute full compensation for all Study-related services. Per-subject fees shall be paid within </w:t>
+      </w:r>
+      <w:del w:id="208" w:author="정담당 (아주대병원)" w:date="2024-03-11T09:00:00Z">
+        <w:r>
+          <w:rPr>
+            <w:rFonts w:ascii="Times New Roman" w:cs="Times New Roman" w:hAnsi="Times New Roman"/>
+            <w:sz w:val="20"/>
+            <w:szCs w:val="20"/>
+          </w:rPr>
+          <w:delText xml:space="preserve">45</w:delText>
+        </w:r>
+      </w:del>
+      <w:ins w:id="218" w:author="정담당 (아주대병원)" w:date="2024-03-11T09:00:00Z">
+        <w:r>
+          <w:rPr>
+            <w:rFonts w:ascii="Times New Roman" w:cs="Times New Roman" w:hAnsi="Times New Roman"/>
+            <w:sz w:val="20"/>
+            <w:szCs w:val="20"/>
+          </w:rPr>
+          <w:t xml:space="preserve">60</w:t>
+        </w:r>
+      </w:ins>
+      <w:r>
+        <w:rPr>
+          <w:rFonts w:ascii="Times New Roman" w:cs="Times New Roman" w:hAnsi="Times New Roman"/>
+          <w:sz w:val="20"/>
+          <w:szCs w:val="20"/>
+        </w:rPr>
+        <w:t xml:space="preserve"> calendar days of Sponsor's receipt of a valid invoice. All invoices shall be submitted in the format specified in Exhibit D.</w:t>
+      </w:r>
+    </w:p>
+    <w:p>
+      <w:pPr>
+        <w:spacing w:after="80" w:before="180"/>
       </w:pPr>
       <w:r>
         <w:rPr>
@@ -1163,12 +1281,40 @@
           <w:sz w:val="20"/>
           <w:szCs w:val="20"/>
         </w:rPr>
-        <w:t xml:space="preserve">Sponsor shall pay a one-time site initiation fee of KRW 5,000,000 upon execution of this Order and satisfactory completion of Site Initiation Visit (SIV). IRB submission fees and MFDS notification fees shall be reimbursed at cost within 30 days of submission of supporting documentation. No markup shall be applied to pass-through regulatory fees.</w:t>
-      </w:r>
-    </w:p>
-    <w:p>
-      <w:pPr>
-        <w:spacing w:after="80" w:before="160"/>
+        <w:t xml:space="preserve">Sponsor shall pay a one-time site initiation fee of KRW </w:t>
+      </w:r>
+      <w:del w:id="209" w:author="정담당 (아주대병원)" w:date="2024-03-11T09:00:00Z">
+        <w:r>
+          <w:rPr>
+            <w:rFonts w:ascii="Times New Roman" w:cs="Times New Roman" w:hAnsi="Times New Roman"/>
+            <w:sz w:val="20"/>
+            <w:szCs w:val="20"/>
+          </w:rPr>
+          <w:delText xml:space="preserve">5,000,000</w:delText>
+        </w:r>
+      </w:del>
+      <w:ins w:id="219" w:author="정담당 (아주대병원)" w:date="2024-03-11T09:00:00Z">
+        <w:r>
+          <w:rPr>
+            <w:rFonts w:ascii="Times New Roman" w:cs="Times New Roman" w:hAnsi="Times New Roman"/>
+            <w:sz w:val="20"/>
+            <w:szCs w:val="20"/>
+          </w:rPr>
+          <w:t xml:space="preserve">8,000,000</w:t>
+        </w:r>
+      </w:ins>
+      <w:r>
+        <w:rPr>
+          <w:rFonts w:ascii="Times New Roman" w:cs="Times New Roman" w:hAnsi="Times New Roman"/>
+          <w:sz w:val="20"/>
+          <w:szCs w:val="20"/>
+        </w:rPr>
+        <w:t xml:space="preserve"> upon execution and satisfactory completion of the Site Initiation Visit (SIV). IRB submission fees and MFDS notification fees shall be reimbursed at cost within 30 days of submission of supporting documentation.</w:t>
+      </w:r>
+    </w:p>
+    <w:p>
+      <w:pPr>
+        <w:spacing w:after="80" w:before="180"/>
       </w:pPr>
       <w:r>
         <w:rPr>
@@ -1192,7 +1338,7 @@
           <w:sz w:val="20"/>
           <w:szCs w:val="20"/>
         </w:rPr>
-        <w:t xml:space="preserve">Sponsor reserves the right to withhold payment of any amount in good-faith dispute pending resolution. Sponsor shall provide written notice of any disputed amount within 15 days of invoice receipt. Any undisputed portion shall be paid on schedule. Interest shall accrue on undisputed overdue amounts at the rate of 6% per annum from the due date.</w:t>
+        <w:t xml:space="preserve">Sponsor reserves the right to withhold payment of any amount in good-faith dispute. Sponsor shall provide written notice of any disputed amount within 15 days of invoice receipt. Interest shall accrue on undisputed overdue amounts at 6% per annum from the due date.</w:t>
       </w:r>
     </w:p>
     <w:p>
@@ -1200,7 +1346,7 @@
         <w:pBdr>
           <w:bottom w:val="single" w:color="1A2D4A" w:sz="6"/>
         </w:pBdr>
-        <w:spacing w:after="120" w:before="280"/>
+        <w:spacing w:after="120" w:before="320"/>
       </w:pPr>
       <w:r>
         <w:rPr>
@@ -1216,7 +1362,7 @@
     </w:p>
     <w:p>
       <w:pPr>
-        <w:spacing w:after="80" w:before="160"/>
+        <w:spacing w:after="80" w:before="180"/>
       </w:pPr>
       <w:r>
         <w:rPr>
@@ -1240,12 +1386,40 @@
           <w:sz w:val="20"/>
           <w:szCs w:val="20"/>
         </w:rPr>
-        <w:t xml:space="preserve">Each party agrees to maintain in strict confidence all Confidential Information received from the other party and to use such information solely for the purpose of performing its obligations under this Order. Confidential Information shall not be disclosed to any third party without prior written consent of the disclosing party. This obligation shall survive termination of this Order for a period of 10 years.</w:t>
-      </w:r>
-    </w:p>
-    <w:p>
-      <w:pPr>
-        <w:spacing w:after="80" w:before="160"/>
+        <w:t xml:space="preserve">Each party agrees to maintain in strict confidence all Confidential Information received from the other party. This obligation shall survive termination of this Order for a period of </w:t>
+      </w:r>
+      <w:del w:id="210" w:author="정담당 (아주대병원)" w:date="2024-03-11T09:00:00Z">
+        <w:r>
+          <w:rPr>
+            <w:rFonts w:ascii="Times New Roman" w:cs="Times New Roman" w:hAnsi="Times New Roman"/>
+            <w:sz w:val="20"/>
+            <w:szCs w:val="20"/>
+          </w:rPr>
+          <w:delText xml:space="preserve">10</w:delText>
+        </w:r>
+      </w:del>
+      <w:ins w:id="220" w:author="정담당 (아주대병원)" w:date="2024-03-11T09:00:00Z">
+        <w:r>
+          <w:rPr>
+            <w:rFonts w:ascii="Times New Roman" w:cs="Times New Roman" w:hAnsi="Times New Roman"/>
+            <w:sz w:val="20"/>
+            <w:szCs w:val="20"/>
+          </w:rPr>
+          <w:t xml:space="preserve">5</w:t>
+        </w:r>
+      </w:ins>
+      <w:r>
+        <w:rPr>
+          <w:rFonts w:ascii="Times New Roman" w:cs="Times New Roman" w:hAnsi="Times New Roman"/>
+          <w:sz w:val="20"/>
+          <w:szCs w:val="20"/>
+        </w:rPr>
+        <w:t xml:space="preserve"> years. Confidential Information shall not be disclosed to any third party without prior written consent of the disclosing party.</w:t>
+      </w:r>
+    </w:p>
+    <w:p>
+      <w:pPr>
+        <w:spacing w:after="80" w:before="180"/>
       </w:pPr>
       <w:r>
         <w:rPr>
@@ -1269,12 +1443,12 @@
           <w:sz w:val="20"/>
           <w:szCs w:val="20"/>
         </w:rPr>
-        <w:t xml:space="preserve">All Study Data, results, and inventions arising from the Study that are generated solely by Institution personnel in the performance of this Order shall be jointly owned by Sponsor and Institution, with Sponsor retaining an exclusive, royalty-free license for commercial exploitation. Sponsor retains all rights to its Background IP. Institution shall promptly disclose any invention arising from the Study to Sponsor in writing.</w:t>
-      </w:r>
-    </w:p>
-    <w:p>
-      <w:pPr>
-        <w:spacing w:after="80" w:before="160"/>
+        <w:t xml:space="preserve">All Study Data and inventions arising from the Study shall be jointly owned by Sponsor and Institution, with Sponsor retaining an exclusive, royalty-free license for commercial exploitation. Institution shall promptly disclose any invention arising from the Study to Sponsor in writing.</w:t>
+      </w:r>
+    </w:p>
+    <w:p>
+      <w:pPr>
+        <w:spacing w:after="80" w:before="180"/>
       </w:pPr>
       <w:r>
         <w:rPr>
@@ -1298,7 +1472,35 @@
           <w:sz w:val="20"/>
           <w:szCs w:val="20"/>
         </w:rPr>
-        <w:t xml:space="preserve">Institution and Principal Investigator shall have the right to publish Study results following Sponsor's written review, which shall be completed within 60 calendar days of submission of the proposed manuscript. Sponsor may request a delay of up to an additional 90 days for the purpose of filing patent applications. Sponsor shall not have the right to suppress publication of Study results; however, Sponsor may request removal of Confidential Information that is not necessary for scientific integrity.</w:t>
+        <w:t xml:space="preserve">Institution and Principal Investigator shall have the right to publish Study results following Sponsor's written review, which shall be completed within </w:t>
+      </w:r>
+      <w:del w:id="211" w:author="박연구 (삼성바이오로직스)" w:date="2024-04-14T09:00:00Z">
+        <w:r>
+          <w:rPr>
+            <w:rFonts w:ascii="Times New Roman" w:cs="Times New Roman" w:hAnsi="Times New Roman"/>
+            <w:sz w:val="20"/>
+            <w:szCs w:val="20"/>
+          </w:rPr>
+          <w:delText xml:space="preserve">60</w:delText>
+        </w:r>
+      </w:del>
+      <w:ins w:id="221" w:author="박연구 (삼성바이오로직스)" w:date="2024-04-14T09:00:00Z">
+        <w:r>
+          <w:rPr>
+            <w:rFonts w:ascii="Times New Roman" w:cs="Times New Roman" w:hAnsi="Times New Roman"/>
+            <w:sz w:val="20"/>
+            <w:szCs w:val="20"/>
+          </w:rPr>
+          <w:t xml:space="preserve">45</w:t>
+        </w:r>
+      </w:ins>
+      <w:r>
+        <w:rPr>
+          <w:rFonts w:ascii="Times New Roman" w:cs="Times New Roman" w:hAnsi="Times New Roman"/>
+          <w:sz w:val="20"/>
+          <w:szCs w:val="20"/>
+        </w:rPr>
+        <w:t xml:space="preserve"> calendar days of submission of the proposed manuscript. Sponsor may request a delay of up to 90 additional days for patent filings.</w:t>
       </w:r>
     </w:p>
     <w:p>
@@ -1306,7 +1508,7 @@
         <w:pBdr>
           <w:bottom w:val="single" w:color="1A2D4A" w:sz="6"/>
         </w:pBdr>
-        <w:spacing w:after="120" w:before="280"/>
+        <w:spacing w:after="120" w:before="320"/>
       </w:pPr>
       <w:r>
         <w:rPr>
@@ -1322,7 +1524,7 @@
     </w:p>
     <w:p>
       <w:pPr>
-        <w:spacing w:after="80" w:before="160"/>
+        <w:spacing w:after="80" w:before="180"/>
       </w:pPr>
       <w:r>
         <w:rPr>
@@ -1346,12 +1548,12 @@
           <w:sz w:val="20"/>
           <w:szCs w:val="20"/>
         </w:rPr>
-        <w:t xml:space="preserve">Sponsor shall defend, indemnify, and hold harmless Institution, its affiliates, officers, directors, employees, and agents from and against any claims, losses, or liabilities arising from: (a) the use of IMP in accordance with the protocol; (b) Sponsor's gross negligence or willful misconduct; or (c) any breach by Sponsor of this Order. This indemnification obligation shall not apply to claims arising from Institution's own negligence, misconduct, or breach.</w:t>
-      </w:r>
-    </w:p>
-    <w:p>
-      <w:pPr>
-        <w:spacing w:after="80" w:before="160"/>
+        <w:t xml:space="preserve">Sponsor shall defend, indemnify, and hold harmless Institution from claims arising from: (a) the use of IMP in accordance with the protocol; (b) Sponsor's gross negligence or willful misconduct; or (c) any breach by Sponsor of this Order. This indemnification shall not apply to claims arising from Institution's own negligence or breach.</w:t>
+      </w:r>
+    </w:p>
+    <w:p>
+      <w:pPr>
+        <w:spacing w:after="80" w:before="180"/>
       </w:pPr>
       <w:r>
         <w:rPr>
@@ -1375,7 +1577,7 @@
           <w:sz w:val="20"/>
           <w:szCs w:val="20"/>
         </w:rPr>
-        <w:t xml:space="preserve">Sponsor shall maintain, at its sole expense, comprehensive clinical trial liability insurance with a minimum coverage of USD 10,000,000 per occurrence throughout the term of this Order and for a tail period of 5 years following Study completion. Institution shall maintain appropriate professional liability and general liability insurance covering its obligations under this Order.</w:t>
+        <w:t xml:space="preserve">Sponsor shall maintain comprehensive clinical trial liability insurance with minimum coverage of USD 10,000,000 per occurrence throughout the term of this Order and for a tail period of 5 years following Study completion.</w:t>
       </w:r>
     </w:p>
     <w:p>
@@ -1383,7 +1585,7 @@
         <w:pBdr>
           <w:bottom w:val="single" w:color="1A2D4A" w:sz="6"/>
         </w:pBdr>
-        <w:spacing w:after="120" w:before="280"/>
+        <w:spacing w:after="120" w:before="320"/>
       </w:pPr>
       <w:r>
         <w:rPr>
@@ -1412,7 +1614,7 @@
     </w:p>
     <w:p>
       <w:pPr>
-        <w:spacing w:after="0" w:before="400"/>
+        <w:spacing w:after="0" w:before="360"/>
       </w:pPr>
       <w:r>
         <w:t xml:space="preserve"/>
@@ -1696,7 +1898,7 @@
         <w:sz w:val="16"/>
         <w:szCs w:val="16"/>
       </w:rPr>
-      <w:t xml:space="preserve">  |  Samsung Biologics × Ajou University Hospital  |  PROPRIETARY &amp; CONFIDENTIAL</w:t>
+      <w:t xml:space="preserve">  |  Samsung Biologics x Ajou University Hospital  |  CONFIDENTIAL</w:t>
     </w:r>
   </w:p>
 </w:ftr>
@@ -1860,19 +2062,8 @@
 <file path=word/styles.xml><?xml version="1.0" encoding="utf-8"?>
 <w:styles xmlns:mc="http://schemas.openxmlformats.org/markup-compatibility/2006" xmlns:r="http://schemas.openxmlformats.org/officeDocument/2006/relationships" xmlns:w="http://schemas.openxmlformats.org/wordprocessingml/2006/main" xmlns:w14="http://schemas.microsoft.com/office/word/2010/wordml" xmlns:w15="http://schemas.microsoft.com/office/word/2012/wordml" mc:Ignorable="w14 w15">
   <w:docDefaults>
-    <w:rPrDefault>
-      <w:rPr>
-        <w:rFonts w:ascii="Times New Roman" w:cs="Times New Roman" w:eastAsia="Times New Roman" w:hAnsi="Times New Roman"/>
-        <w:color w:val="1A2D4A"/>
-        <w:sz w:val="20"/>
-        <w:szCs w:val="20"/>
-      </w:rPr>
-    </w:rPrDefault>
-    <w:pPrDefault>
-      <w:pPr>
-        <w:spacing w:line="320" w:lineRule="auto"/>
-      </w:pPr>
-    </w:pPrDefault>
+    <w:rPrDefault/>
+    <w:pPrDefault/>
   </w:docDefaults>
   <w:style w:type="paragraph" w:styleId="Title">
     <w:name w:val="Title"/>

</xml_diff>

<commit_message>
docs: CTA Draft v8 — English contract body, Korean comments
</commit_message>
<xml_diff>
--- a/assets/docs/CTA_SB_Draft_v8_최종수정본.docx
+++ b/assets/docs/CTA_SB_Draft_v8_최종수정본.docx
@@ -5,7 +5,7 @@
     <w:p>
       <w:pPr>
         <w:jc w:val="center"/>
-        <w:spacing w:before="200" w:after="200"/>
+        <w:spacing w:before="200" w:after="100"/>
       </w:pPr>
       <w:r>
         <w:rPr>
@@ -13,7 +13,7 @@
           <w:sz w:val="32"/>
           <w:szCs w:val="32"/>
         </w:rPr>
-        <w:t>임상시험 위탁 계약서</w:t>
+        <w:t>CLINICAL TRIAL AGREEMENT</w:t>
       </w:r>
     </w:p>
     <w:p>
@@ -23,24 +23,10 @@
       </w:pPr>
       <w:r>
         <w:rPr>
-          <w:b/>
-          <w:sz w:val="22"/>
-          <w:szCs w:val="22"/>
-        </w:rPr>
-        <w:t>Clinical Trial Agreement (CTA)</w:t>
-      </w:r>
-    </w:p>
-    <w:p>
-      <w:pPr>
-        <w:jc w:val="center"/>
-        <w:spacing w:before="0" w:after="100"/>
-      </w:pPr>
-      <w:r>
-        <w:rPr>
-          <w:sz w:val="18"/>
-          <w:szCs w:val="18"/>
-        </w:rPr>
-        <w:t>계약번호: SB-2024-LC3-001　|　IRB 번호: 51039　|　초안번호: v8</w:t>
+          <w:sz w:val="18"/>
+          <w:szCs w:val="18"/>
+        </w:rPr>
+        <w:t>Contract No. SB-2024-LC3-001  |  IRB No. 51039  |  Draft v8</w:t>
       </w:r>
     </w:p>
     <w:p>
@@ -53,7 +39,7 @@
           <w:sz w:val="18"/>
           <w:szCs w:val="18"/>
         </w:rPr>
-        <w:t>연구명: LUMINOS-3 폐암 3상 다기관 임상시험</w:t>
+        <w:t>Study Title: LUMINOS-3 Phase III Multi-center Clinical Trial in Non-Small Cell Lung Cancer</w:t>
       </w:r>
     </w:p>
     <w:p>
@@ -67,19 +53,19 @@
           <w:sz w:val="28"/>
           <w:szCs w:val="28"/>
         </w:rPr>
-        <w:t>제1조. 계약 당사자 및 일반 조항</w:t>
-      </w:r>
-    </w:p>
-    <w:p>
-      <w:pPr>
-        <w:spacing w:before="0" w:after="120"/>
-      </w:pPr>
-      <w:r>
-        <w:rPr>
-          <w:sz w:val="20"/>
-          <w:szCs w:val="20"/>
-        </w:rPr>
-        <w:t xml:space="preserve">본 계약은 다음 당사자 간에 체결된다:</w:t>
+        <w:t>ARTICLE 1. PARTIES AND GENERAL PROVISIONS</w:t>
+      </w:r>
+    </w:p>
+    <w:p>
+      <w:pPr>
+        <w:spacing w:before="0" w:after="120"/>
+      </w:pPr>
+      <w:r>
+        <w:rPr>
+          <w:sz w:val="20"/>
+          <w:szCs w:val="20"/>
+        </w:rPr>
+        <w:t xml:space="preserve">This Agreement is entered into by and between the following parties:</w:t>
       </w:r>
     </w:p>
     <w:p>
@@ -92,7 +78,7 @@
           <w:sz w:val="20"/>
           <w:szCs w:val="20"/>
         </w:rPr>
-        <w:t xml:space="preserve">• 의뢰자(Sponsor): 삼성바이오로직스 주식회사 (이하 '의뢰자'), 대표이사 김태형</w:t>
+        <w:t xml:space="preserve">Sponsor: Samsung Biologics Co., Ltd. ('Sponsor'), represented by CEO Kim Tae-hyung</w:t>
       </w:r>
     </w:p>
     <w:p>
@@ -105,43 +91,43 @@
           <w:sz w:val="20"/>
           <w:szCs w:val="20"/>
         </w:rPr>
-        <w:t xml:space="preserve">• 수탁기관(Site): 아주대학교병원 (이하 '기관'), 원장 이승우</w:t>
-      </w:r>
-    </w:p>
-    <w:p>
-      <w:pPr>
-        <w:spacing w:before="0" w:after="120"/>
-      </w:pPr>
-      <w:r>
-        <w:rPr>
-          <w:sz w:val="20"/>
-          <w:szCs w:val="20"/>
-        </w:rPr>
-        <w:t xml:space="preserve">본 계약은 「약사법」 제34조, 「의약품 임상시험 관리기준」(KGCP) 및 ICH E6(R2) 가이드라인에 따라 체결된다.</w:t>
-      </w:r>
-    </w:p>
-    <w:p>
-      <w:pPr>
-        <w:spacing w:before="0" w:after="120"/>
-      </w:pPr>
-      <w:r>
-        <w:rPr>
-          <w:sz w:val="20"/>
-          <w:szCs w:val="20"/>
-        </w:rPr>
-        <w:t xml:space="preserve">계약 유효기간은 양 당사자의 서명일로부터 최종 데이터 락(Data Lock) 완료 후 2년까지로 한다.</w:t>
-      </w:r>
-    </w:p>
-    <w:p>
-      <w:pPr>
-        <w:spacing w:before="0" w:after="120"/>
-      </w:pPr>
-      <w:r>
-        <w:rPr>
-          <w:sz w:val="20"/>
-          <w:szCs w:val="20"/>
-        </w:rPr>
-        <w:t xml:space="preserve">1.4　연구 종료 예정일은 </w:t>
+        <w:t xml:space="preserve">Institution: Ajou University Hospital ('Institution'), represented by President Lee Seung-woo</w:t>
+      </w:r>
+    </w:p>
+    <w:p>
+      <w:pPr>
+        <w:spacing w:before="0" w:after="120"/>
+      </w:pPr>
+      <w:r>
+        <w:rPr>
+          <w:sz w:val="20"/>
+          <w:szCs w:val="20"/>
+        </w:rPr>
+        <w:t xml:space="preserve">This Agreement shall be governed by the Pharmaceutical Affairs Act, the Korean Good Clinical Practice (KGCP), and ICH E6(R2) guidelines.</w:t>
+      </w:r>
+    </w:p>
+    <w:p>
+      <w:pPr>
+        <w:spacing w:before="0" w:after="120"/>
+      </w:pPr>
+      <w:r>
+        <w:rPr>
+          <w:sz w:val="20"/>
+          <w:szCs w:val="20"/>
+        </w:rPr>
+        <w:t xml:space="preserve">The term of this Agreement shall commence on the date of execution and continue until two (2) years after final Data Lock.</w:t>
+      </w:r>
+    </w:p>
+    <w:p>
+      <w:pPr>
+        <w:spacing w:before="0" w:after="120"/>
+      </w:pPr>
+      <w:r>
+        <w:rPr>
+          <w:sz w:val="20"/>
+          <w:szCs w:val="20"/>
+        </w:rPr>
+        <w:t xml:space="preserve">1.4  The anticipated study completion date shall be </w:t>
       </w:r>
       <w:del w:id="10" w:author="정담당 (아주대병원)" w:date="2024-03-26T14:00:00Z">
         <w:r>
@@ -149,7 +135,7 @@
             <w:sz w:val="20"/>
             <w:szCs w:val="20"/>
           </w:rPr>
-          <w:delText xml:space="preserve">2027년 12월 31일</w:delText>
+          <w:delText xml:space="preserve">31 December 2027</w:delText>
         </w:r>
       </w:del>
       <w:ins w:id="11" w:author="정담당 (아주대병원)" w:date="2024-03-26T14:00:00Z">
@@ -158,7 +144,7 @@
             <w:sz w:val="20"/>
             <w:szCs w:val="20"/>
           </w:rPr>
-          <w:t xml:space="preserve">2028년 6월 30일</w:t>
+          <w:t xml:space="preserve">30 June 2028</w:t>
         </w:r>
       </w:ins>
       <w:r>
@@ -166,7 +152,7 @@
           <w:sz w:val="20"/>
           <w:szCs w:val="20"/>
         </w:rPr>
-        <w:t xml:space="preserve">로 한다. 단, 양 당사자 합의 시 연장 가능하다.</w:t>
+        <w:t xml:space="preserve">. Such date may be extended by mutual written agreement of the parties.</w:t>
       </w:r>
     </w:p>
     <w:p>
@@ -180,31 +166,31 @@
           <w:sz w:val="28"/>
           <w:szCs w:val="28"/>
         </w:rPr>
-        <w:t>제2조. 임상시험 수행</w:t>
-      </w:r>
-    </w:p>
-    <w:p>
-      <w:pPr>
-        <w:spacing w:before="0" w:after="120"/>
-      </w:pPr>
-      <w:r>
-        <w:rPr>
-          <w:sz w:val="20"/>
-          <w:szCs w:val="20"/>
-        </w:rPr>
-        <w:t xml:space="preserve">2.1　기관은 의뢰자가 제공하는 시험계획서(Protocol No. LUMINOS-3-KR-001)에 따라 임상시험을 수행하며, 프로토콜 준수 의무를 진다.</w:t>
-      </w:r>
-    </w:p>
-    <w:p>
-      <w:pPr>
-        <w:spacing w:before="0" w:after="120"/>
-      </w:pPr>
-      <w:r>
-        <w:rPr>
-          <w:sz w:val="20"/>
-          <w:szCs w:val="20"/>
-        </w:rPr>
-        <w:t xml:space="preserve">2.2　</w:t>
+        <w:t>ARTICLE 2. CONDUCT OF THE CLINICAL TRIAL</w:t>
+      </w:r>
+    </w:p>
+    <w:p>
+      <w:pPr>
+        <w:spacing w:before="0" w:after="120"/>
+      </w:pPr>
+      <w:r>
+        <w:rPr>
+          <w:sz w:val="20"/>
+          <w:szCs w:val="20"/>
+        </w:rPr>
+        <w:t xml:space="preserve">2.1  The Institution shall conduct the clinical trial in strict accordance with the Protocol (Protocol No. LUMINOS-3-KR-001) provided by the Sponsor, and shall comply with all applicable regulatory requirements.</w:t>
+      </w:r>
+    </w:p>
+    <w:p>
+      <w:pPr>
+        <w:spacing w:before="0" w:after="120"/>
+      </w:pPr>
+      <w:r>
+        <w:rPr>
+          <w:sz w:val="20"/>
+          <w:szCs w:val="20"/>
+        </w:rPr>
+        <w:t xml:space="preserve">2.2  </w:t>
       </w:r>
       <w:commentRangeStart w:id="0"/>
       <w:del w:id="12" w:author="정담당 (아주대병원)" w:date="2024-03-26T14:00:00Z">
@@ -213,7 +199,7 @@
             <w:sz w:val="20"/>
             <w:szCs w:val="20"/>
           </w:rPr>
-          <w:delText xml:space="preserve">기관은 시험약 관련 중대한 이상반응(SAE) 또는 예상치 못한 중대한 부작용(SUSAR) 발생 즉시(24시간 이내) 의뢰자에게 유선 또는 전자메일로 통보하여야 하며, 72시간 이내 서면 보고서를 제출하여야 한다.</w:delText>
+          <w:delText xml:space="preserve">The Institution shall notify the Sponsor immediately (within 24 hours) by phone or email upon occurrence of any Serious Adverse Event (SAE) or Suspected Unexpected Serious Adverse Reaction (SUSAR) related to the Investigational Product, and shall submit a written report within 72 hours.</w:delText>
         </w:r>
       </w:del>
       <w:commentRangeEnd w:id="0"/>
@@ -228,7 +214,7 @@
           <w:sz w:val="20"/>
           <w:szCs w:val="20"/>
         </w:rPr>
-        <w:t xml:space="preserve"> [삭제됨 — 아래 2.2(개정)으로 대체]</w:t>
+        <w:t xml:space="preserve">  [Deleted — replaced by Section 2.2 (Revised) below]</w:t>
       </w:r>
     </w:p>
     <w:p>
@@ -241,7 +227,7 @@
             <w:sz w:val="20"/>
             <w:szCs w:val="20"/>
           </w:rPr>
-          <w:t xml:space="preserve">2.2(개정)　기관은 SAE 발생 후 48시간 이내에 의뢰자에게 전자메일로 통보하고, 7영업일 이내 서면 보고서를 제출하여야 한다. SUSAR의 경우 별도 규정에 따른다.</w:t>
+          <w:t xml:space="preserve">2.2 (Revised)  The Institution shall notify the Sponsor by email within 48 hours of an SAE occurrence and shall submit a written report within 7 business days. For SUSARs, the applicable regulatory reporting timelines shall apply.</w:t>
         </w:r>
       </w:ins>
     </w:p>
@@ -255,7 +241,7 @@
             <w:sz w:val="20"/>
             <w:szCs w:val="20"/>
           </w:rPr>
-          <w:t xml:space="preserve">2.3　기관은 프로토콜 이탈(Protocol Deviation) 발생 시 발생일로부터 5영업일 이내에 의뢰자에게 보고하고, 이탈 원인 분석 및 재발 방지 대책을 14영업일 이내 제출하여야 한다.</w:t>
+          <w:t xml:space="preserve">2.3  In the event of a Protocol Deviation, the Institution shall report such deviation to the Sponsor within 5 business days of occurrence and shall submit a root cause analysis and corrective action plan within 14 business days.</w:t>
         </w:r>
       </w:ins>
     </w:p>
@@ -268,7 +254,7 @@
           <w:sz w:val="20"/>
           <w:szCs w:val="20"/>
         </w:rPr>
-        <w:t xml:space="preserve">2.4　모든 임상시험 데이터는 의뢰자가 지정한 EDC 시스템(Medidata Rave)에 방문일로부터 </w:t>
+        <w:t xml:space="preserve">2.4  All clinical trial data shall be entered into the Sponsor-designated EDC system (Medidata Rave) within </w:t>
       </w:r>
       <w:del w:id="15" w:author="정담당 (아주대병원)" w:date="2024-03-11T09:00:00Z">
         <w:r>
@@ -276,7 +262,7 @@
             <w:sz w:val="20"/>
             <w:szCs w:val="20"/>
           </w:rPr>
-          <w:delText xml:space="preserve">5영업일</w:delText>
+          <w:delText xml:space="preserve">5 business days</w:delText>
         </w:r>
       </w:del>
       <w:ins w:id="16" w:author="정담당 (아주대병원)" w:date="2024-03-11T09:00:00Z">
@@ -285,7 +271,7 @@
             <w:sz w:val="20"/>
             <w:szCs w:val="20"/>
           </w:rPr>
-          <w:t xml:space="preserve">7영업일</w:t>
+          <w:t xml:space="preserve">7 business days</w:t>
         </w:r>
       </w:ins>
       <w:r>
@@ -293,7 +279,7 @@
           <w:sz w:val="20"/>
           <w:szCs w:val="20"/>
         </w:rPr>
-        <w:t xml:space="preserve"> 이내 입력하여야 한다.</w:t>
+        <w:t xml:space="preserve"> of the subject visit date.</w:t>
       </w:r>
     </w:p>
     <w:p>
@@ -307,43 +293,43 @@
           <w:sz w:val="28"/>
           <w:szCs w:val="28"/>
         </w:rPr>
-        <w:t>제3조. 시험약 관리</w:t>
-      </w:r>
-    </w:p>
-    <w:p>
-      <w:pPr>
-        <w:spacing w:before="0" w:after="120"/>
-      </w:pPr>
-      <w:r>
-        <w:rPr>
-          <w:sz w:val="20"/>
-          <w:szCs w:val="20"/>
-        </w:rPr>
-        <w:t xml:space="preserve">3.1　의뢰자는 기관의 시험약 수령 요청 후 14영업일 이내에 시험약을 공급하여야 한다.</w:t>
-      </w:r>
-    </w:p>
-    <w:p>
-      <w:pPr>
-        <w:spacing w:before="0" w:after="120"/>
-      </w:pPr>
-      <w:r>
-        <w:rPr>
-          <w:sz w:val="20"/>
-          <w:szCs w:val="20"/>
-        </w:rPr>
-        <w:t xml:space="preserve">3.2　기관은 시험약을 별도 잠금 시설에 보관하고, 온도 기록지를 매월 의뢰자에게 제출하여야 한다.</w:t>
-      </w:r>
-    </w:p>
-    <w:p>
-      <w:pPr>
-        <w:spacing w:before="0" w:after="120"/>
-      </w:pPr>
-      <w:r>
-        <w:rPr>
-          <w:sz w:val="20"/>
-          <w:szCs w:val="20"/>
-        </w:rPr>
-        <w:t xml:space="preserve">3.3　시험 완료 또는 조기 종료 시, 기관은 사용 잔여 시험약 및 포장재를 30일 이내 의뢰자에게 반납하거나, 의뢰자의 서면 지시에 따라 폐기하여야 한다. </w:t>
+        <w:t>ARTICLE 3. INVESTIGATIONAL PRODUCT</w:t>
+      </w:r>
+    </w:p>
+    <w:p>
+      <w:pPr>
+        <w:spacing w:before="0" w:after="120"/>
+      </w:pPr>
+      <w:r>
+        <w:rPr>
+          <w:sz w:val="20"/>
+          <w:szCs w:val="20"/>
+        </w:rPr>
+        <w:t xml:space="preserve">3.1  The Sponsor shall supply the Investigational Product to the Institution within 14 business days of receipt of the Institution's written supply request.</w:t>
+      </w:r>
+    </w:p>
+    <w:p>
+      <w:pPr>
+        <w:spacing w:before="0" w:after="120"/>
+      </w:pPr>
+      <w:r>
+        <w:rPr>
+          <w:sz w:val="20"/>
+          <w:szCs w:val="20"/>
+        </w:rPr>
+        <w:t xml:space="preserve">3.2  The Institution shall store the Investigational Product in a designated locked facility and shall submit temperature logs to the Sponsor on a monthly basis.</w:t>
+      </w:r>
+    </w:p>
+    <w:p>
+      <w:pPr>
+        <w:spacing w:before="0" w:after="120"/>
+      </w:pPr>
+      <w:r>
+        <w:rPr>
+          <w:sz w:val="20"/>
+          <w:szCs w:val="20"/>
+        </w:rPr>
+        <w:t xml:space="preserve">3.3  Upon study completion or early termination, the Institution shall return all unused Investigational Product and packaging materials to the Sponsor within 30 days, or dispose of them in accordance with the Sponsor's written instructions. </w:t>
       </w:r>
       <w:commentRangeStart w:id="2"/>
       <w:r>
@@ -351,7 +337,7 @@
           <w:sz w:val="20"/>
           <w:szCs w:val="20"/>
         </w:rPr>
-        <w:t xml:space="preserve">반납 비용은 의뢰자가 부담한다.</w:t>
+        <w:t xml:space="preserve">All costs associated with such return shipment shall be borne by the Sponsor.</w:t>
       </w:r>
       <w:commentRangeEnd w:id="2"/>
       <w:r>
@@ -379,19 +365,19 @@
           <w:sz w:val="28"/>
           <w:szCs w:val="28"/>
         </w:rPr>
-        <w:t>제4조. 피험자 등록</w:t>
-      </w:r>
-    </w:p>
-    <w:p>
-      <w:pPr>
-        <w:spacing w:before="0" w:after="120"/>
-      </w:pPr>
-      <w:r>
-        <w:rPr>
-          <w:sz w:val="20"/>
-          <w:szCs w:val="20"/>
-        </w:rPr>
-        <w:t xml:space="preserve">4.1　기관은 IRB 최종 승인 및 계약 체결일로부터 </w:t>
+        <w:t>ARTICLE 4. SUBJECT ENROLLMENT</w:t>
+      </w:r>
+    </w:p>
+    <w:p>
+      <w:pPr>
+        <w:spacing w:before="0" w:after="120"/>
+      </w:pPr>
+      <w:r>
+        <w:rPr>
+          <w:sz w:val="20"/>
+          <w:szCs w:val="20"/>
+        </w:rPr>
+        <w:t xml:space="preserve">4.1  The Institution shall enroll the first subject within </w:t>
       </w:r>
       <w:commentRangeStart w:id="4"/>
       <w:del w:id="17" w:author="박연구 (삼성바이오로직스)" w:date="2024-07-01T09:00:00Z">
@@ -400,7 +386,7 @@
             <w:sz w:val="20"/>
             <w:szCs w:val="20"/>
           </w:rPr>
-          <w:delText xml:space="preserve">30일</w:delText>
+          <w:delText xml:space="preserve">30 calendar days</w:delText>
         </w:r>
       </w:del>
       <w:ins w:id="18" w:author="박연구 (삼성바이오로직스)" w:date="2024-07-10T15:00:00Z">
@@ -409,7 +395,7 @@
             <w:sz w:val="20"/>
             <w:szCs w:val="20"/>
           </w:rPr>
-          <w:t xml:space="preserve">45일</w:t>
+          <w:t xml:space="preserve">45 calendar days</w:t>
         </w:r>
       </w:ins>
       <w:commentRangeEnd w:id="4"/>
@@ -424,19 +410,19 @@
           <w:sz w:val="20"/>
           <w:szCs w:val="20"/>
         </w:rPr>
-        <w:t xml:space="preserve"> 이내에 첫 피험자를 등록하여야 한다.</w:t>
-      </w:r>
-    </w:p>
-    <w:p>
-      <w:pPr>
-        <w:spacing w:before="0" w:after="120"/>
-      </w:pPr>
-      <w:r>
-        <w:rPr>
-          <w:sz w:val="20"/>
-          <w:szCs w:val="20"/>
-        </w:rPr>
-        <w:t xml:space="preserve">4.2　기관의 피험자 등록 목표 수는 </w:t>
+        <w:t xml:space="preserve"> of final IRB approval and execution of this Agreement.</w:t>
+      </w:r>
+    </w:p>
+    <w:p>
+      <w:pPr>
+        <w:spacing w:before="0" w:after="120"/>
+      </w:pPr>
+      <w:r>
+        <w:rPr>
+          <w:sz w:val="20"/>
+          <w:szCs w:val="20"/>
+        </w:rPr>
+        <w:t xml:space="preserve">4.2  The Institution's enrollment target shall be </w:t>
       </w:r>
       <w:del w:id="19" w:author="정담당 (아주대병원)" w:date="2024-03-26T14:00:00Z">
         <w:r>
@@ -444,7 +430,7 @@
             <w:sz w:val="20"/>
             <w:szCs w:val="20"/>
           </w:rPr>
-          <w:delText xml:space="preserve">12명</w:delText>
+          <w:delText xml:space="preserve">12 subjects</w:delText>
         </w:r>
       </w:del>
       <w:ins w:id="20" w:author="정담당 (아주대병원)" w:date="2024-03-26T14:00:00Z">
@@ -453,7 +439,7 @@
             <w:sz w:val="20"/>
             <w:szCs w:val="20"/>
           </w:rPr>
-          <w:t xml:space="preserve">8명</w:t>
+          <w:t xml:space="preserve">8 subjects</w:t>
         </w:r>
       </w:ins>
       <w:r>
@@ -461,7 +447,7 @@
           <w:sz w:val="20"/>
           <w:szCs w:val="20"/>
         </w:rPr>
-        <w:t xml:space="preserve">으로 한다. 단, 임상시험 진행 상황에 따라 의뢰자의 요청으로 조정 가능하다.</w:t>
+        <w:t xml:space="preserve">. Such target may be adjusted upon the Sponsor's written request based on overall study progress.</w:t>
       </w:r>
     </w:p>
     <w:p>
@@ -475,7 +461,7 @@
             <w:sz w:val="20"/>
             <w:szCs w:val="20"/>
           </w:rPr>
-          <w:t xml:space="preserve">4.3　의뢰자의 귀책 사유로 임상시험이 조기 종료되는 경우, 의뢰자는 기관에게 해당 시점까지의 비용 및 등록 피험자 1인당 위약금 500,000원을 추가로 지급하여야 한다.</w:t>
+          <w:t xml:space="preserve">4.3  In the event of early termination due to Sponsor's fault, the Sponsor shall pay the Institution all costs incurred to the date of termination plus a penalty fee of KRW 500,000 per enrolled subject.</w:t>
         </w:r>
       </w:ins>
       <w:commentRangeEnd w:id="6"/>
@@ -497,19 +483,19 @@
           <w:sz w:val="28"/>
           <w:szCs w:val="28"/>
         </w:rPr>
-        <w:t>제5조. 연구비 및 지급 조건</w:t>
-      </w:r>
-    </w:p>
-    <w:p>
-      <w:pPr>
-        <w:spacing w:before="0" w:after="120"/>
-      </w:pPr>
-      <w:r>
-        <w:rPr>
-          <w:sz w:val="20"/>
-          <w:szCs w:val="20"/>
-        </w:rPr>
-        <w:t xml:space="preserve">5.1　의뢰자는 기관에 다음의 연구비를 지급한다:</w:t>
+        <w:t>ARTICLE 5. COMPENSATION AND PAYMENT</w:t>
+      </w:r>
+    </w:p>
+    <w:p>
+      <w:pPr>
+        <w:spacing w:before="0" w:after="120"/>
+      </w:pPr>
+      <w:r>
+        <w:rPr>
+          <w:sz w:val="20"/>
+          <w:szCs w:val="20"/>
+        </w:rPr>
+        <w:t xml:space="preserve">5.1  The Sponsor shall pay the Institution the following fees:</w:t>
       </w:r>
     </w:p>
     <w:p>
@@ -522,7 +508,7 @@
           <w:sz w:val="20"/>
           <w:szCs w:val="20"/>
         </w:rPr>
-        <w:t xml:space="preserve">• 스타트업 비용: </w:t>
+        <w:t xml:space="preserve">•  Start-up Fee: </w:t>
       </w:r>
       <w:del w:id="22" w:author="정담당 (아주대병원)" w:date="2024-03-11T09:00:00Z">
         <w:r>
@@ -547,7 +533,7 @@
           <w:sz w:val="20"/>
           <w:szCs w:val="20"/>
         </w:rPr>
-        <w:t xml:space="preserve"> (계약 체결 후 30일 이내)</w:t>
+        <w:t xml:space="preserve"> (payable within 30 days of Agreement execution)</w:t>
       </w:r>
     </w:p>
     <w:p>
@@ -560,7 +546,7 @@
           <w:sz w:val="20"/>
           <w:szCs w:val="20"/>
         </w:rPr>
-        <w:t xml:space="preserve">• 피험자 방문별 비용: 프로토콜 별첨 Schedule of Events 참조</w:t>
+        <w:t xml:space="preserve">•  Per-visit Fees: As set forth in the Protocol Schedule of Events (Exhibit A)</w:t>
       </w:r>
     </w:p>
     <w:p>
@@ -573,7 +559,7 @@
           <w:sz w:val="20"/>
           <w:szCs w:val="20"/>
         </w:rPr>
-        <w:t xml:space="preserve">• 종료 비용: KRW 2,000,000 (데이터 락 후 60일 이내)</w:t>
+        <w:t xml:space="preserve">•  Close-out Fee: KRW 2,000,000 (payable within 60 days of Data Lock)</w:t>
       </w:r>
     </w:p>
     <w:p>
@@ -587,7 +573,7 @@
             <w:sz w:val="20"/>
             <w:szCs w:val="20"/>
           </w:rPr>
-          <w:t xml:space="preserve">5.2　기관은 총 직접비의 15%에 해당하는 간접비(간접경비)를 청구할 권리를 갖는다. 간접비는 각 청구서에 별도 명시하여야 한다.</w:t>
+          <w:t xml:space="preserve">5.2  The Institution shall be entitled to charge an indirect cost (overhead) of 15% of total direct costs. Indirect costs shall be itemized separately on each invoice.</w:t>
         </w:r>
       </w:ins>
       <w:commentRangeEnd w:id="8"/>
@@ -607,7 +593,7 @@
           <w:sz w:val="20"/>
           <w:szCs w:val="20"/>
         </w:rPr>
-        <w:t xml:space="preserve">5.3　의뢰자는 기관의 청구서 수령일로부터 </w:t>
+        <w:t xml:space="preserve">5.3  The Sponsor shall remit payment within </w:t>
       </w:r>
       <w:del w:id="25" w:author="정담당 (아주대병원)" w:date="2024-03-11T09:00:00Z">
         <w:r>
@@ -615,7 +601,7 @@
             <w:sz w:val="20"/>
             <w:szCs w:val="20"/>
           </w:rPr>
-          <w:delText xml:space="preserve">45일</w:delText>
+          <w:delText xml:space="preserve">45 days</w:delText>
         </w:r>
       </w:del>
       <w:ins w:id="26" w:author="정담당 (아주대병원)" w:date="2024-03-11T09:00:00Z">
@@ -624,7 +610,7 @@
             <w:sz w:val="20"/>
             <w:szCs w:val="20"/>
           </w:rPr>
-          <w:t xml:space="preserve">60일</w:t>
+          <w:t xml:space="preserve">60 days</w:t>
         </w:r>
       </w:ins>
       <w:r>
@@ -632,19 +618,19 @@
           <w:sz w:val="20"/>
           <w:szCs w:val="20"/>
         </w:rPr>
-        <w:t xml:space="preserve"> 이내에 지급하여야 한다. 지연 시 연 6%의 지연이자가 부과된다.</w:t>
-      </w:r>
-    </w:p>
-    <w:p>
-      <w:pPr>
-        <w:spacing w:before="0" w:after="120"/>
-      </w:pPr>
-      <w:r>
-        <w:rPr>
-          <w:sz w:val="20"/>
-          <w:szCs w:val="20"/>
-        </w:rPr>
-        <w:t xml:space="preserve">5.4　기관은 방문 완료 후 </w:t>
+        <w:t xml:space="preserve"> of receipt of a valid invoice. Late payments shall accrue interest at 6% per annum.</w:t>
+      </w:r>
+    </w:p>
+    <w:p>
+      <w:pPr>
+        <w:spacing w:before="0" w:after="120"/>
+      </w:pPr>
+      <w:r>
+        <w:rPr>
+          <w:sz w:val="20"/>
+          <w:szCs w:val="20"/>
+        </w:rPr>
+        <w:t xml:space="preserve">5.4  The Institution shall submit invoices to the Sponsor within </w:t>
       </w:r>
       <w:del w:id="27" w:author="박연구 (삼성바이오로직스)" w:date="2024-04-14T11:00:00Z">
         <w:r>
@@ -652,7 +638,7 @@
             <w:sz w:val="20"/>
             <w:szCs w:val="20"/>
           </w:rPr>
-          <w:delText xml:space="preserve">30일</w:delText>
+          <w:delText xml:space="preserve">30 days</w:delText>
         </w:r>
       </w:del>
       <w:ins w:id="28" w:author="박연구 (삼성바이오로직스)" w:date="2024-04-14T11:00:00Z">
@@ -661,7 +647,7 @@
             <w:sz w:val="20"/>
             <w:szCs w:val="20"/>
           </w:rPr>
-          <w:t xml:space="preserve">14일</w:t>
+          <w:t xml:space="preserve">14 days</w:t>
         </w:r>
       </w:ins>
       <w:r>
@@ -669,7 +655,7 @@
           <w:sz w:val="20"/>
           <w:szCs w:val="20"/>
         </w:rPr>
-        <w:t xml:space="preserve"> 이내에 의뢰자에게 청구서를 제출하여야 한다.</w:t>
+        <w:t xml:space="preserve"> of completion of each study visit.</w:t>
       </w:r>
     </w:p>
     <w:p>
@@ -683,31 +669,31 @@
           <w:sz w:val="28"/>
           <w:szCs w:val="28"/>
         </w:rPr>
-        <w:t>제6조. 지식재산권 및 데이터 소유권</w:t>
-      </w:r>
-    </w:p>
-    <w:p>
-      <w:pPr>
-        <w:spacing w:before="0" w:after="120"/>
-      </w:pPr>
-      <w:r>
-        <w:rPr>
-          <w:sz w:val="20"/>
-          <w:szCs w:val="20"/>
-        </w:rPr>
-        <w:t xml:space="preserve">6.1　본 임상시험 과정에서 생성된 모든 데이터, 결과물 및 발명은 의뢰자에게 귀속된다.</w:t>
-      </w:r>
-    </w:p>
-    <w:p>
-      <w:pPr>
-        <w:spacing w:before="0" w:after="120"/>
-      </w:pPr>
-      <w:r>
-        <w:rPr>
-          <w:sz w:val="20"/>
-          <w:szCs w:val="20"/>
-        </w:rPr>
-        <w:t xml:space="preserve">6.2　기관 연구자는 임상시험 결과를 학술지에 발표할 권리를 보유한다. 발표 전 </w:t>
+        <w:t>ARTICLE 6. INTELLECTUAL PROPERTY AND DATA OWNERSHIP</w:t>
+      </w:r>
+    </w:p>
+    <w:p>
+      <w:pPr>
+        <w:spacing w:before="0" w:after="120"/>
+      </w:pPr>
+      <w:r>
+        <w:rPr>
+          <w:sz w:val="20"/>
+          <w:szCs w:val="20"/>
+        </w:rPr>
+        <w:t xml:space="preserve">6.1  All data, results, and inventions arising from this clinical trial shall be owned by the Sponsor.</w:t>
+      </w:r>
+    </w:p>
+    <w:p>
+      <w:pPr>
+        <w:spacing w:before="0" w:after="120"/>
+      </w:pPr>
+      <w:r>
+        <w:rPr>
+          <w:sz w:val="20"/>
+          <w:szCs w:val="20"/>
+        </w:rPr>
+        <w:t xml:space="preserve">6.2  Investigators at the Institution retain the right to publish trial results in peer-reviewed journals. Prior to submission, the Institution shall provide the Sponsor with a draft manuscript at least </w:t>
       </w:r>
       <w:del w:id="29" w:author="박연구 (삼성바이오로직스)" w:date="2024-05-02T10:00:00Z">
         <w:r>
@@ -715,7 +701,7 @@
             <w:sz w:val="20"/>
             <w:szCs w:val="20"/>
           </w:rPr>
-          <w:delText xml:space="preserve">60일</w:delText>
+          <w:delText xml:space="preserve">60 days</w:delText>
         </w:r>
       </w:del>
       <w:ins w:id="30" w:author="박연구 (삼성바이오로직스)" w:date="2024-05-02T10:00:00Z">
@@ -724,7 +710,7 @@
             <w:sz w:val="20"/>
             <w:szCs w:val="20"/>
           </w:rPr>
-          <w:t xml:space="preserve">45일</w:t>
+          <w:t xml:space="preserve">45 days</w:t>
         </w:r>
       </w:ins>
       <w:r>
@@ -732,7 +718,7 @@
           <w:sz w:val="20"/>
           <w:szCs w:val="20"/>
         </w:rPr>
-        <w:t xml:space="preserve"> 전에 의뢰자에게 초고를 제공하여 기밀 정보 검토 기회를 부여하여야 한다.</w:t>
+        <w:t xml:space="preserve"> in advance to allow review for confidential information.</w:t>
       </w:r>
     </w:p>
     <w:p>
@@ -753,7 +739,7 @@
             <w:sz w:val="20"/>
             <w:szCs w:val="20"/>
           </w:rPr>
-          <w:delText xml:space="preserve">6.3　기관 연구자가 임상시험 수행 중 발명한 특허 가능한 기술에 대해, 의뢰자는 우선 협상권을 갖는다. 기관은 특허 출원 전 의뢰자에게 사전 통보하여야 하며, 의뢰자의 서면 동의 없이 제3자에게 기술을 이전하거나 라이선스를 부여할 수 없다.</w:delText>
+          <w:delText xml:space="preserve">6.3  With respect to any patentable invention conceived or reduced to practice by Institution investigators in the conduct of this trial, the Sponsor shall have a right of first negotiation. The Institution shall provide prior written notice to the Sponsor before filing any patent application and shall not transfer or license such technology to any third party without the Sponsor's prior written consent.</w:delText>
         </w:r>
       </w:del>
       <w:commentRangeEnd w:id="10"/>
@@ -782,19 +768,19 @@
           <w:sz w:val="28"/>
           <w:szCs w:val="28"/>
         </w:rPr>
-        <w:t>제7조. 비밀유지</w:t>
-      </w:r>
-    </w:p>
-    <w:p>
-      <w:pPr>
-        <w:spacing w:before="0" w:after="120"/>
-      </w:pPr>
-      <w:r>
-        <w:rPr>
-          <w:sz w:val="20"/>
-          <w:szCs w:val="20"/>
-        </w:rPr>
-        <w:t xml:space="preserve">7.1　양 당사자는 계약 종료 후 </w:t>
+        <w:t>ARTICLE 7. CONFIDENTIALITY</w:t>
+      </w:r>
+    </w:p>
+    <w:p>
+      <w:pPr>
+        <w:spacing w:before="0" w:after="120"/>
+      </w:pPr>
+      <w:r>
+        <w:rPr>
+          <w:sz w:val="20"/>
+          <w:szCs w:val="20"/>
+        </w:rPr>
+        <w:t xml:space="preserve">7.1  Each party shall maintain the confidentiality of the other party's Confidential Information for a period of </w:t>
       </w:r>
       <w:del w:id="32" w:author="정담당 (아주대병원)" w:date="2024-03-11T09:00:00Z">
         <w:r>
@@ -802,7 +788,7 @@
             <w:sz w:val="20"/>
             <w:szCs w:val="20"/>
           </w:rPr>
-          <w:delText xml:space="preserve">10년</w:delText>
+          <w:delText xml:space="preserve">ten (10) years</w:delText>
         </w:r>
       </w:del>
       <w:ins w:id="33" w:author="정담당 (아주대병원)" w:date="2024-03-11T09:00:00Z">
@@ -811,7 +797,7 @@
             <w:sz w:val="20"/>
             <w:szCs w:val="20"/>
           </w:rPr>
-          <w:t xml:space="preserve">5년</w:t>
+          <w:t xml:space="preserve">five (5) years</w:t>
         </w:r>
       </w:ins>
       <w:r>
@@ -819,19 +805,19 @@
           <w:sz w:val="20"/>
           <w:szCs w:val="20"/>
         </w:rPr>
-        <w:t xml:space="preserve"> 간 상대방의 기밀 정보를 제3자에게 공개하거나 계약 목적 외로 사용하지 않을 의무를 진다.</w:t>
-      </w:r>
-    </w:p>
-    <w:p>
-      <w:pPr>
-        <w:spacing w:before="0" w:after="120"/>
-      </w:pPr>
-      <w:r>
-        <w:rPr>
-          <w:sz w:val="20"/>
-          <w:szCs w:val="20"/>
-        </w:rPr>
-        <w:t xml:space="preserve">7.2　기밀 정보의 예외: 공개 당시 이미 공지된 정보, 독자적으로 개발된 정보, 법령에 의한 공개 요구 정보.</w:t>
+        <w:t xml:space="preserve"> following the expiration or termination of this Agreement.</w:t>
+      </w:r>
+    </w:p>
+    <w:p>
+      <w:pPr>
+        <w:spacing w:before="0" w:after="120"/>
+      </w:pPr>
+      <w:r>
+        <w:rPr>
+          <w:sz w:val="20"/>
+          <w:szCs w:val="20"/>
+        </w:rPr>
+        <w:t xml:space="preserve">7.2  Exceptions to confidentiality obligations include: information already in the public domain at the time of disclosure; information independently developed by the receiving party; and information required to be disclosed by law or regulation.</w:t>
       </w:r>
     </w:p>
     <w:p>
@@ -845,31 +831,31 @@
           <w:sz w:val="28"/>
           <w:szCs w:val="28"/>
         </w:rPr>
-        <w:t>제8조. 면책 및 배상</w:t>
-      </w:r>
-    </w:p>
-    <w:p>
-      <w:pPr>
-        <w:spacing w:before="0" w:after="120"/>
-      </w:pPr>
-      <w:r>
-        <w:rPr>
-          <w:sz w:val="20"/>
-          <w:szCs w:val="20"/>
-        </w:rPr>
-        <w:t xml:space="preserve">8.1　의뢰자는 기관이 프로토콜을 준수하는 중 발생한 피험자 상해에 대해 배상 책임을 진다.</w:t>
-      </w:r>
-    </w:p>
-    <w:p>
-      <w:pPr>
-        <w:spacing w:before="0" w:after="120"/>
-      </w:pPr>
-      <w:r>
-        <w:rPr>
-          <w:sz w:val="20"/>
-          <w:szCs w:val="20"/>
-        </w:rPr>
-        <w:t xml:space="preserve">8.2　기관이 프로토콜 위반, 과실 또는 고의로 인해 발생한 상해의 경우 기관이 배상 책임을 진다.</w:t>
+        <w:t>ARTICLE 8. INDEMNIFICATION</w:t>
+      </w:r>
+    </w:p>
+    <w:p>
+      <w:pPr>
+        <w:spacing w:before="0" w:after="120"/>
+      </w:pPr>
+      <w:r>
+        <w:rPr>
+          <w:sz w:val="20"/>
+          <w:szCs w:val="20"/>
+        </w:rPr>
+        <w:t xml:space="preserve">8.1  The Sponsor shall indemnify and hold harmless the Institution against any claims arising from subject injury occurring while the Institution is in compliance with the Protocol.</w:t>
+      </w:r>
+    </w:p>
+    <w:p>
+      <w:pPr>
+        <w:spacing w:before="0" w:after="120"/>
+      </w:pPr>
+      <w:r>
+        <w:rPr>
+          <w:sz w:val="20"/>
+          <w:szCs w:val="20"/>
+        </w:rPr>
+        <w:t xml:space="preserve">8.2  The Institution shall be responsible for claims arising from its own negligence, willful misconduct, or Protocol non-compliance.</w:t>
       </w:r>
     </w:p>
     <w:p>
@@ -890,7 +876,7 @@
             <w:sz w:val="20"/>
             <w:szCs w:val="20"/>
           </w:rPr>
-          <w:delText xml:space="preserve">8.3　어느 한 당사자의 본 계약 위반으로 인한 배상 총액은 계약 체결 후 최근 12개월간 실제 지급된 연구비의 200%를 초과할 수 없다. 단, 피험자 신체 상해, 사망, 또는 사기·고의 행위로 인한 손해는 상기 한도 적용 대상에서 제외된다.</w:delText>
+          <w:delText xml:space="preserve">8.3  The aggregate liability of either party under this Agreement shall not exceed two hundred percent (200%) of the total fees actually paid to the Institution in the twelve (12) months preceding the event giving rise to the claim. This limitation shall not apply to claims arising from personal injury, death, fraud, or willful misconduct.</w:delText>
         </w:r>
       </w:del>
       <w:commentRangeEnd w:id="12"/>
@@ -917,7 +903,7 @@
           <w:sz w:val="20"/>
           <w:szCs w:val="20"/>
         </w:rPr>
-        <w:t xml:space="preserve">8.4　의뢰자는 임상시험 관련 제3자 소송에 대해 기관을 방어(방소)할 의무를 진다. 기관은 소송 통보 후 14일 이내에 의뢰자에게 서면으로 알려야 한다.</w:t>
+        <w:t xml:space="preserve">8.4  The Sponsor shall defend the Institution against any third-party claims arising from the conduct of the clinical trial. The Institution shall notify the Sponsor in writing within 14 days of receiving notice of any such claim.</w:t>
       </w:r>
     </w:p>
     <w:p>
@@ -931,31 +917,31 @@
           <w:sz w:val="28"/>
           <w:szCs w:val="28"/>
         </w:rPr>
-        <w:t>제9조. 계약 해지</w:t>
-      </w:r>
-    </w:p>
-    <w:p>
-      <w:pPr>
-        <w:spacing w:before="0" w:after="120"/>
-      </w:pPr>
-      <w:r>
-        <w:rPr>
-          <w:sz w:val="20"/>
-          <w:szCs w:val="20"/>
-        </w:rPr>
-        <w:t xml:space="preserve">9.1　어느 한 당사자는 30일 전 서면 통보로 본 계약을 해지할 수 있다. 단, 피험자 안전에 관한 사항은 즉시 효력을 갖는다.</w:t>
-      </w:r>
-    </w:p>
-    <w:p>
-      <w:pPr>
-        <w:spacing w:before="0" w:after="120"/>
-      </w:pPr>
-      <w:r>
-        <w:rPr>
-          <w:sz w:val="20"/>
-          <w:szCs w:val="20"/>
-        </w:rPr>
-        <w:t xml:space="preserve">9.2　계약 해지 시, 의뢰자는 해지 통보일까지 완료된 방문 비용 및 발생한 직접 비용을 기관에 지급하여야 한다. </w:t>
+        <w:t>ARTICLE 9. TERMINATION</w:t>
+      </w:r>
+    </w:p>
+    <w:p>
+      <w:pPr>
+        <w:spacing w:before="0" w:after="120"/>
+      </w:pPr>
+      <w:r>
+        <w:rPr>
+          <w:sz w:val="20"/>
+          <w:szCs w:val="20"/>
+        </w:rPr>
+        <w:t xml:space="preserve">9.1  Either party may terminate this Agreement upon 30 days' prior written notice. Provisions relating to subject safety shall take effect immediately upon termination.</w:t>
+      </w:r>
+    </w:p>
+    <w:p>
+      <w:pPr>
+        <w:spacing w:before="0" w:after="120"/>
+      </w:pPr>
+      <w:r>
+        <w:rPr>
+          <w:sz w:val="20"/>
+          <w:szCs w:val="20"/>
+        </w:rPr>
+        <w:t xml:space="preserve">9.2  Upon termination, the Sponsor shall pay the Institution for all visits completed and direct costs incurred up to the date of termination notice. </w:t>
       </w:r>
       <w:commentRangeStart w:id="14"/>
       <w:r>
@@ -963,7 +949,7 @@
           <w:sz w:val="20"/>
           <w:szCs w:val="20"/>
         </w:rPr>
-        <w:t xml:space="preserve">미완료 피험자 방문 비용은 지급하지 않는다.</w:t>
+        <w:t xml:space="preserve">No payment shall be made for subject visits that were initiated but not completed.</w:t>
       </w:r>
       <w:commentRangeEnd w:id="14"/>
       <w:r>
@@ -977,7 +963,7 @@
           <w:sz w:val="20"/>
           <w:szCs w:val="20"/>
         </w:rPr>
-        <w:t xml:space="preserve"> 잔여 물품의 반납은 제3.3조에 따른다.</w:t>
+        <w:t xml:space="preserve"> Return of study materials shall be governed by Section 3.3.</w:t>
       </w:r>
     </w:p>
     <w:p>
@@ -991,19 +977,19 @@
           <w:sz w:val="28"/>
           <w:szCs w:val="28"/>
         </w:rPr>
-        <w:t>제10조. 서명란</w:t>
-      </w:r>
-    </w:p>
-    <w:p>
-      <w:pPr>
-        <w:spacing w:before="0" w:after="120"/>
-      </w:pPr>
-      <w:r>
-        <w:rPr>
-          <w:sz w:val="20"/>
-          <w:szCs w:val="20"/>
-        </w:rPr>
-        <w:t xml:space="preserve">본 계약의 효력은 양 당사자의 권한 있는 대표자가 서명한 날로부터 발생한다.</w:t>
+        <w:t>ARTICLE 10. SIGNATURES</w:t>
+      </w:r>
+    </w:p>
+    <w:p>
+      <w:pPr>
+        <w:spacing w:before="0" w:after="120"/>
+      </w:pPr>
+      <w:r>
+        <w:rPr>
+          <w:sz w:val="20"/>
+          <w:szCs w:val="20"/>
+        </w:rPr>
+        <w:t xml:space="preserve">This Agreement shall become effective upon execution by duly authorized representatives of both parties.</w:t>
       </w:r>
     </w:p>
     <w:p>
@@ -1016,31 +1002,31 @@
           <w:sz w:val="20"/>
           <w:szCs w:val="20"/>
         </w:rPr>
-        <w:t>의뢰자 (삼성바이오로직스)</w:t>
-      </w:r>
-    </w:p>
-    <w:p>
-      <w:pPr>
-        <w:spacing w:before="0" w:after="120"/>
-      </w:pPr>
-      <w:r>
-        <w:rPr>
-          <w:sz w:val="20"/>
-          <w:szCs w:val="20"/>
-        </w:rPr>
-        <w:t xml:space="preserve">성명: _______________________　　서명: _______________________</w:t>
-      </w:r>
-    </w:p>
-    <w:p>
-      <w:pPr>
-        <w:spacing w:before="0" w:after="120"/>
-      </w:pPr>
-      <w:r>
-        <w:rPr>
-          <w:sz w:val="20"/>
-          <w:szCs w:val="20"/>
-        </w:rPr>
-        <w:t xml:space="preserve">직위: _______________________　　날짜: _______________________</w:t>
+        <w:t>SPONSOR: Samsung Biologics Co., Ltd.</w:t>
+      </w:r>
+    </w:p>
+    <w:p>
+      <w:pPr>
+        <w:spacing w:before="0" w:after="120"/>
+      </w:pPr>
+      <w:r>
+        <w:rPr>
+          <w:sz w:val="20"/>
+          <w:szCs w:val="20"/>
+        </w:rPr>
+        <w:t xml:space="preserve">Name: _______________________     Signature: _______________________</w:t>
+      </w:r>
+    </w:p>
+    <w:p>
+      <w:pPr>
+        <w:spacing w:before="0" w:after="120"/>
+      </w:pPr>
+      <w:r>
+        <w:rPr>
+          <w:sz w:val="20"/>
+          <w:szCs w:val="20"/>
+        </w:rPr>
+        <w:t xml:space="preserve">Title: _______________________      Date: _______________________</w:t>
       </w:r>
     </w:p>
     <w:p>
@@ -1053,31 +1039,31 @@
           <w:sz w:val="20"/>
           <w:szCs w:val="20"/>
         </w:rPr>
-        <w:t>수탁기관 (아주대학교병원)</w:t>
-      </w:r>
-    </w:p>
-    <w:p>
-      <w:pPr>
-        <w:spacing w:before="0" w:after="120"/>
-      </w:pPr>
-      <w:r>
-        <w:rPr>
-          <w:sz w:val="20"/>
-          <w:szCs w:val="20"/>
-        </w:rPr>
-        <w:t xml:space="preserve">성명: _______________________　　서명: _______________________</w:t>
-      </w:r>
-    </w:p>
-    <w:p>
-      <w:pPr>
-        <w:spacing w:before="0" w:after="120"/>
-      </w:pPr>
-      <w:r>
-        <w:rPr>
-          <w:sz w:val="20"/>
-          <w:szCs w:val="20"/>
-        </w:rPr>
-        <w:t xml:space="preserve">직위: _______________________　　날짜: _______________________</w:t>
+        <w:t>INSTITUTION: Ajou University Hospital</w:t>
+      </w:r>
+    </w:p>
+    <w:p>
+      <w:pPr>
+        <w:spacing w:before="0" w:after="120"/>
+      </w:pPr>
+      <w:r>
+        <w:rPr>
+          <w:sz w:val="20"/>
+          <w:szCs w:val="20"/>
+        </w:rPr>
+        <w:t xml:space="preserve">Name: _______________________     Signature: _______________________</w:t>
+      </w:r>
+    </w:p>
+    <w:p>
+      <w:pPr>
+        <w:spacing w:before="0" w:after="120"/>
+      </w:pPr>
+      <w:r>
+        <w:rPr>
+          <w:sz w:val="20"/>
+          <w:szCs w:val="20"/>
+        </w:rPr>
+        <w:t xml:space="preserve">Title: _______________________      Date: _______________________</w:t>
       </w:r>
     </w:p>
     <w:sectPr>
@@ -1383,43 +1369,43 @@
 
 <file path=word/commentsExtended.xml><?xml version="1.0" encoding="utf-8"?>
 <w15:commentsEx xmlns:w15="http://schemas.microsoft.com/office/word/2012/wordml">
-  <w15:commentEx w15:paraId="B9D2A9CC" w15:done="0"/>
-  <w15:commentEx w15:paraId="DCEBB82D" w15:done="0" w15:paraIdParent="B9D2A9CC"/>
-  <w15:commentEx w15:paraId="B6DFE453" w15:done="0"/>
-  <w15:commentEx w15:paraId="37DFEAFB" w15:done="0" w15:paraIdParent="B6DFE453"/>
-  <w15:commentEx w15:paraId="ACCE5F39" w15:done="0"/>
-  <w15:commentEx w15:paraId="4F1A1018" w15:done="0" w15:paraIdParent="ACCE5F39"/>
-  <w15:commentEx w15:paraId="47D4D036" w15:done="0"/>
-  <w15:commentEx w15:paraId="ADC81E7E" w15:done="0" w15:paraIdParent="47D4D036"/>
-  <w15:commentEx w15:paraId="A41A20F5" w15:done="0"/>
-  <w15:commentEx w15:paraId="8B279BBA" w15:done="0" w15:paraIdParent="A41A20F5"/>
-  <w15:commentEx w15:paraId="D57E4569" w15:done="0"/>
-  <w15:commentEx w15:paraId="39AC4927" w15:done="0" w15:paraIdParent="D57E4569"/>
-  <w15:commentEx w15:paraId="D76A7E15" w15:done="0"/>
-  <w15:commentEx w15:paraId="6E50A3C7" w15:done="0" w15:paraIdParent="D76A7E15"/>
-  <w15:commentEx w15:paraId="515B41C6" w15:done="0"/>
-  <w15:commentEx w15:paraId="2B29D214" w15:done="0" w15:paraIdParent="2B29D214"/>
+  <w15:commentEx w15:paraId="9CCAF5D5" w15:done="0"/>
+  <w15:commentEx w15:paraId="B7C7E761" w15:done="0" w15:paraIdParent="9CCAF5D5"/>
+  <w15:commentEx w15:paraId="FC113698" w15:done="0"/>
+  <w15:commentEx w15:paraId="08A5CC62" w15:done="0" w15:paraIdParent="FC113698"/>
+  <w15:commentEx w15:paraId="913B4638" w15:done="0"/>
+  <w15:commentEx w15:paraId="3E2CDD2B" w15:done="0" w15:paraIdParent="913B4638"/>
+  <w15:commentEx w15:paraId="A1FCFC15" w15:done="0"/>
+  <w15:commentEx w15:paraId="A247A1D2" w15:done="0" w15:paraIdParent="A1FCFC15"/>
+  <w15:commentEx w15:paraId="47893588" w15:done="0"/>
+  <w15:commentEx w15:paraId="A8B5B291" w15:done="0" w15:paraIdParent="47893588"/>
+  <w15:commentEx w15:paraId="B4E12655" w15:done="0"/>
+  <w15:commentEx w15:paraId="F2AC9A62" w15:done="0" w15:paraIdParent="B4E12655"/>
+  <w15:commentEx w15:paraId="082D4394" w15:done="0"/>
+  <w15:commentEx w15:paraId="2FDC38B6" w15:done="0" w15:paraIdParent="082D4394"/>
+  <w15:commentEx w15:paraId="F5BAD648" w15:done="0"/>
+  <w15:commentEx w15:paraId="934817A3" w15:done="0" w15:paraIdParent="934817A3"/>
 </w15:commentsEx>
 </file>
 
 <file path=word/commentsIds.xml><?xml version="1.0" encoding="utf-8"?>
 <w16cid:commentsIds xmlns:w16cid="http://schemas.microsoft.com/office/word/2016/wordml/cid">
-  <w16cid:commentId w16cid:id="0" w16cid:durableId="3634504"/>
-  <w16cid:commentId w16cid:id="1" w16cid:durableId="9210997"/>
-  <w16cid:commentId w16cid:id="2" w16cid:durableId="9391457"/>
-  <w16cid:commentId w16cid:id="3" w16cid:durableId="4616972"/>
-  <w16cid:commentId w16cid:id="4" w16cid:durableId="8776666"/>
-  <w16cid:commentId w16cid:id="5" w16cid:durableId="4463912"/>
-  <w16cid:commentId w16cid:id="6" w16cid:durableId="4909086"/>
-  <w16cid:commentId w16cid:id="7" w16cid:durableId="7323947"/>
-  <w16cid:commentId w16cid:id="8" w16cid:durableId="9805785"/>
-  <w16cid:commentId w16cid:id="9" w16cid:durableId="6878715"/>
-  <w16cid:commentId w16cid:id="10" w16cid:durableId="1115241"/>
-  <w16cid:commentId w16cid:id="11" w16cid:durableId="6792786"/>
-  <w16cid:commentId w16cid:id="12" w16cid:durableId="3051511"/>
-  <w16cid:commentId w16cid:id="13" w16cid:durableId="6267814"/>
-  <w16cid:commentId w16cid:id="14" w16cid:durableId="6721386"/>
-  <w16cid:commentId w16cid:id="15" w16cid:durableId="7325090"/>
+  <w16cid:commentId w16cid:id="0" w16cid:durableId="2961775"/>
+  <w16cid:commentId w16cid:id="1" w16cid:durableId="4697531"/>
+  <w16cid:commentId w16cid:id="2" w16cid:durableId="2471608"/>
+  <w16cid:commentId w16cid:id="3" w16cid:durableId="5773301"/>
+  <w16cid:commentId w16cid:id="4" w16cid:durableId="1500745"/>
+  <w16cid:commentId w16cid:id="5" w16cid:durableId="9849346"/>
+  <w16cid:commentId w16cid:id="6" w16cid:durableId="6037541"/>
+  <w16cid:commentId w16cid:id="7" w16cid:durableId="4028482"/>
+  <w16cid:commentId w16cid:id="8" w16cid:durableId="7506902"/>
+  <w16cid:commentId w16cid:id="9" w16cid:durableId="8301606"/>
+  <w16cid:commentId w16cid:id="10" w16cid:durableId="8439352"/>
+  <w16cid:commentId w16cid:id="11" w16cid:durableId="3912018"/>
+  <w16cid:commentId w16cid:id="12" w16cid:durableId="5851240"/>
+  <w16cid:commentId w16cid:id="13" w16cid:durableId="8372054"/>
+  <w16cid:commentId w16cid:id="14" w16cid:durableId="8498670"/>
+  <w16cid:commentId w16cid:id="15" w16cid:durableId="8000580"/>
 </w16cid:commentsIds>
 </file>
 

</xml_diff>